<commit_message>
docs(autoevaluacion): restaurar la autoevaluación 2.2 completa de Iahn Vera (tarea 8.4)
La versión completa entró a qa por el PR #19 (5e23e9a), pero el commit
39b4bd9 la borró y con el PR #20 quedó la plantilla en blanco en qa y
main. Se recupera el archivo tal como estaba en 5e23e9a.

Co-Authored-By: Claude Opus 5.5 <noreply@anthropic.com>
</commit_message>
<xml_diff>
--- a/Fase 2/Evidencias Individuales/Vera_Iahn_2.2_APT122_AutoevaluacionAvance Fase2.docx
+++ b/Fase 2/Evidencias Individuales/Vera_Iahn_2.2_APT122_AutoevaluacionAvance Fase2.docx
@@ -9373,6 +9373,25 @@
             </w:pPr>
             <w:r>
               <w:rPr>
+                <w:rFonts w:ascii="Calibri" w:hAnsi="Calibri" w:cs="Calibri" w:eastAsia="Calibri"/>
+                <w:b/>
+                <w:i w:val="0"/>
+                <w:color w:val="000000"/>
+                <w:sz w:val="24"/>
+              </w:rPr>
+              <w:t>☒</w:t>
+            </w:r>
+          </w:p>
+          <w:p>
+            <w:pPr>
+              <w:jc w:val="both"/>
+              <w:rPr>
+                <w:rFonts w:ascii="Calibri" w:cs="Calibri" w:eastAsia="Calibri" w:hAnsi="Calibri"/>
+                <w:color w:val="000000"/>
+              </w:rPr>
+            </w:pPr>
+            <w:r>
+              <w:rPr>
                 <w:rFonts w:ascii="Calibri" w:cs="Calibri" w:eastAsia="Calibri" w:hAnsi="Calibri"/>
                 <w:color w:val="000000"/>
                 <w:rtl w:val="0"/>
@@ -9393,6 +9412,25 @@
             </w:pPr>
             <w:r>
               <w:rPr>
+                <w:rFonts w:ascii="Calibri" w:hAnsi="Calibri" w:cs="Calibri" w:eastAsia="Calibri"/>
+                <w:b/>
+                <w:i w:val="0"/>
+                <w:color w:val="000000"/>
+                <w:sz w:val="24"/>
+              </w:rPr>
+              <w:t>☐</w:t>
+            </w:r>
+          </w:p>
+          <w:p>
+            <w:pPr>
+              <w:jc w:val="both"/>
+              <w:rPr>
+                <w:rFonts w:ascii="Calibri" w:cs="Calibri" w:eastAsia="Calibri" w:hAnsi="Calibri"/>
+                <w:color w:val="000000"/>
+              </w:rPr>
+            </w:pPr>
+            <w:r>
+              <w:rPr>
                 <w:rFonts w:ascii="Calibri" w:cs="Calibri" w:eastAsia="Calibri" w:hAnsi="Calibri"/>
                 <w:color w:val="000000"/>
                 <w:rtl w:val="0"/>
@@ -9413,6 +9451,25 @@
             </w:pPr>
             <w:r>
               <w:rPr>
+                <w:rFonts w:ascii="Calibri" w:hAnsi="Calibri" w:cs="Calibri" w:eastAsia="Calibri"/>
+                <w:b/>
+                <w:i w:val="0"/>
+                <w:color w:val="000000"/>
+                <w:sz w:val="24"/>
+              </w:rPr>
+              <w:t>☐</w:t>
+            </w:r>
+          </w:p>
+          <w:p>
+            <w:pPr>
+              <w:jc w:val="both"/>
+              <w:rPr>
+                <w:rFonts w:ascii="Calibri" w:cs="Calibri" w:eastAsia="Calibri" w:hAnsi="Calibri"/>
+                <w:color w:val="000000"/>
+              </w:rPr>
+            </w:pPr>
+            <w:r>
+              <w:rPr>
                 <w:rFonts w:ascii="Calibri" w:cs="Calibri" w:eastAsia="Calibri" w:hAnsi="Calibri"/>
                 <w:color w:val="000000"/>
                 <w:rtl w:val="0"/>
@@ -9423,6 +9480,25 @@
         </w:tc>
         <w:tc>
           <w:tcPr/>
+          <w:p>
+            <w:pPr>
+              <w:jc w:val="both"/>
+              <w:rPr>
+                <w:rFonts w:ascii="Calibri" w:cs="Calibri" w:eastAsia="Calibri" w:hAnsi="Calibri"/>
+                <w:color w:val="000000"/>
+              </w:rPr>
+            </w:pPr>
+            <w:r>
+              <w:rPr>
+                <w:rFonts w:ascii="Calibri" w:hAnsi="Calibri" w:cs="Calibri" w:eastAsia="Calibri"/>
+                <w:b/>
+                <w:i w:val="0"/>
+                <w:color w:val="000000"/>
+                <w:sz w:val="24"/>
+              </w:rPr>
+              <w:t>☐</w:t>
+            </w:r>
+          </w:p>
           <w:p>
             <w:pPr>
               <w:jc w:val="both"/>
@@ -9506,6 +9582,25 @@
             </w:pPr>
             <w:r>
               <w:rPr>
+                <w:rFonts w:ascii="Calibri" w:hAnsi="Calibri" w:cs="Calibri" w:eastAsia="Calibri"/>
+                <w:b/>
+                <w:i w:val="0"/>
+                <w:color w:val="000000"/>
+                <w:sz w:val="24"/>
+              </w:rPr>
+              <w:t>☐</w:t>
+            </w:r>
+          </w:p>
+          <w:p>
+            <w:pPr>
+              <w:jc w:val="both"/>
+              <w:rPr>
+                <w:rFonts w:ascii="Calibri" w:cs="Calibri" w:eastAsia="Calibri" w:hAnsi="Calibri"/>
+                <w:color w:val="000000"/>
+              </w:rPr>
+            </w:pPr>
+            <w:r>
+              <w:rPr>
                 <w:rFonts w:ascii="Calibri" w:cs="Calibri" w:eastAsia="Calibri" w:hAnsi="Calibri"/>
                 <w:color w:val="000000"/>
                 <w:rtl w:val="0"/>
@@ -9526,6 +9621,25 @@
             </w:pPr>
             <w:r>
               <w:rPr>
+                <w:rFonts w:ascii="Calibri" w:hAnsi="Calibri" w:cs="Calibri" w:eastAsia="Calibri"/>
+                <w:b/>
+                <w:i w:val="0"/>
+                <w:color w:val="000000"/>
+                <w:sz w:val="24"/>
+              </w:rPr>
+              <w:t>☒</w:t>
+            </w:r>
+          </w:p>
+          <w:p>
+            <w:pPr>
+              <w:jc w:val="both"/>
+              <w:rPr>
+                <w:rFonts w:ascii="Calibri" w:cs="Calibri" w:eastAsia="Calibri" w:hAnsi="Calibri"/>
+                <w:color w:val="000000"/>
+              </w:rPr>
+            </w:pPr>
+            <w:r>
+              <w:rPr>
                 <w:rFonts w:ascii="Calibri" w:cs="Calibri" w:eastAsia="Calibri" w:hAnsi="Calibri"/>
                 <w:color w:val="000000"/>
                 <w:rtl w:val="0"/>
@@ -9546,6 +9660,25 @@
             </w:pPr>
             <w:r>
               <w:rPr>
+                <w:rFonts w:ascii="Calibri" w:hAnsi="Calibri" w:cs="Calibri" w:eastAsia="Calibri"/>
+                <w:b/>
+                <w:i w:val="0"/>
+                <w:color w:val="000000"/>
+                <w:sz w:val="24"/>
+              </w:rPr>
+              <w:t>☐</w:t>
+            </w:r>
+          </w:p>
+          <w:p>
+            <w:pPr>
+              <w:jc w:val="both"/>
+              <w:rPr>
+                <w:rFonts w:ascii="Calibri" w:cs="Calibri" w:eastAsia="Calibri" w:hAnsi="Calibri"/>
+                <w:color w:val="000000"/>
+              </w:rPr>
+            </w:pPr>
+            <w:r>
+              <w:rPr>
                 <w:rFonts w:ascii="Calibri" w:cs="Calibri" w:eastAsia="Calibri" w:hAnsi="Calibri"/>
                 <w:color w:val="000000"/>
                 <w:rtl w:val="0"/>
@@ -9556,6 +9689,25 @@
         </w:tc>
         <w:tc>
           <w:tcPr/>
+          <w:p>
+            <w:pPr>
+              <w:jc w:val="both"/>
+              <w:rPr>
+                <w:rFonts w:ascii="Calibri" w:cs="Calibri" w:eastAsia="Calibri" w:hAnsi="Calibri"/>
+                <w:color w:val="000000"/>
+              </w:rPr>
+            </w:pPr>
+            <w:r>
+              <w:rPr>
+                <w:rFonts w:ascii="Calibri" w:hAnsi="Calibri" w:cs="Calibri" w:eastAsia="Calibri"/>
+                <w:b/>
+                <w:i w:val="0"/>
+                <w:color w:val="000000"/>
+                <w:sz w:val="24"/>
+              </w:rPr>
+              <w:t>☐</w:t>
+            </w:r>
+          </w:p>
           <w:p>
             <w:pPr>
               <w:jc w:val="both"/>
@@ -9639,6 +9791,25 @@
             </w:pPr>
             <w:r>
               <w:rPr>
+                <w:rFonts w:ascii="Calibri" w:hAnsi="Calibri" w:cs="Calibri" w:eastAsia="Calibri"/>
+                <w:b/>
+                <w:i w:val="0"/>
+                <w:color w:val="000000"/>
+                <w:sz w:val="24"/>
+              </w:rPr>
+              <w:t>☐</w:t>
+            </w:r>
+          </w:p>
+          <w:p>
+            <w:pPr>
+              <w:jc w:val="both"/>
+              <w:rPr>
+                <w:rFonts w:ascii="Calibri" w:cs="Calibri" w:eastAsia="Calibri" w:hAnsi="Calibri"/>
+                <w:color w:val="000000"/>
+              </w:rPr>
+            </w:pPr>
+            <w:r>
+              <w:rPr>
                 <w:rFonts w:ascii="Calibri" w:cs="Calibri" w:eastAsia="Calibri" w:hAnsi="Calibri"/>
                 <w:color w:val="000000"/>
                 <w:rtl w:val="0"/>
@@ -9659,6 +9830,25 @@
             </w:pPr>
             <w:r>
               <w:rPr>
+                <w:rFonts w:ascii="Calibri" w:hAnsi="Calibri" w:cs="Calibri" w:eastAsia="Calibri"/>
+                <w:b/>
+                <w:i w:val="0"/>
+                <w:color w:val="000000"/>
+                <w:sz w:val="24"/>
+              </w:rPr>
+              <w:t>☒</w:t>
+            </w:r>
+          </w:p>
+          <w:p>
+            <w:pPr>
+              <w:jc w:val="both"/>
+              <w:rPr>
+                <w:rFonts w:ascii="Calibri" w:cs="Calibri" w:eastAsia="Calibri" w:hAnsi="Calibri"/>
+                <w:color w:val="000000"/>
+              </w:rPr>
+            </w:pPr>
+            <w:r>
+              <w:rPr>
                 <w:rFonts w:ascii="Calibri" w:cs="Calibri" w:eastAsia="Calibri" w:hAnsi="Calibri"/>
                 <w:color w:val="000000"/>
                 <w:rtl w:val="0"/>
@@ -9679,6 +9869,25 @@
             </w:pPr>
             <w:r>
               <w:rPr>
+                <w:rFonts w:ascii="Calibri" w:hAnsi="Calibri" w:cs="Calibri" w:eastAsia="Calibri"/>
+                <w:b/>
+                <w:i w:val="0"/>
+                <w:color w:val="000000"/>
+                <w:sz w:val="24"/>
+              </w:rPr>
+              <w:t>☐</w:t>
+            </w:r>
+          </w:p>
+          <w:p>
+            <w:pPr>
+              <w:jc w:val="both"/>
+              <w:rPr>
+                <w:rFonts w:ascii="Calibri" w:cs="Calibri" w:eastAsia="Calibri" w:hAnsi="Calibri"/>
+                <w:color w:val="000000"/>
+              </w:rPr>
+            </w:pPr>
+            <w:r>
+              <w:rPr>
                 <w:rFonts w:ascii="Calibri" w:cs="Calibri" w:eastAsia="Calibri" w:hAnsi="Calibri"/>
                 <w:color w:val="000000"/>
                 <w:rtl w:val="0"/>
@@ -9689,6 +9898,25 @@
         </w:tc>
         <w:tc>
           <w:tcPr/>
+          <w:p>
+            <w:pPr>
+              <w:jc w:val="both"/>
+              <w:rPr>
+                <w:rFonts w:ascii="Calibri" w:cs="Calibri" w:eastAsia="Calibri" w:hAnsi="Calibri"/>
+                <w:color w:val="000000"/>
+              </w:rPr>
+            </w:pPr>
+            <w:r>
+              <w:rPr>
+                <w:rFonts w:ascii="Calibri" w:hAnsi="Calibri" w:cs="Calibri" w:eastAsia="Calibri"/>
+                <w:b/>
+                <w:i w:val="0"/>
+                <w:color w:val="000000"/>
+                <w:sz w:val="24"/>
+              </w:rPr>
+              <w:t>☐</w:t>
+            </w:r>
+          </w:p>
           <w:p>
             <w:pPr>
               <w:jc w:val="both"/>
@@ -9772,6 +10000,25 @@
             </w:pPr>
             <w:r>
               <w:rPr>
+                <w:rFonts w:ascii="Calibri" w:hAnsi="Calibri" w:cs="Calibri" w:eastAsia="Calibri"/>
+                <w:b/>
+                <w:i w:val="0"/>
+                <w:color w:val="000000"/>
+                <w:sz w:val="24"/>
+              </w:rPr>
+              <w:t>☒</w:t>
+            </w:r>
+          </w:p>
+          <w:p>
+            <w:pPr>
+              <w:jc w:val="both"/>
+              <w:rPr>
+                <w:rFonts w:ascii="Calibri" w:cs="Calibri" w:eastAsia="Calibri" w:hAnsi="Calibri"/>
+                <w:color w:val="000000"/>
+              </w:rPr>
+            </w:pPr>
+            <w:r>
+              <w:rPr>
                 <w:rFonts w:ascii="Calibri" w:cs="Calibri" w:eastAsia="Calibri" w:hAnsi="Calibri"/>
                 <w:color w:val="000000"/>
                 <w:rtl w:val="0"/>
@@ -9792,6 +10039,25 @@
             </w:pPr>
             <w:r>
               <w:rPr>
+                <w:rFonts w:ascii="Calibri" w:hAnsi="Calibri" w:cs="Calibri" w:eastAsia="Calibri"/>
+                <w:b/>
+                <w:i w:val="0"/>
+                <w:color w:val="000000"/>
+                <w:sz w:val="24"/>
+              </w:rPr>
+              <w:t>☐</w:t>
+            </w:r>
+          </w:p>
+          <w:p>
+            <w:pPr>
+              <w:jc w:val="both"/>
+              <w:rPr>
+                <w:rFonts w:ascii="Calibri" w:cs="Calibri" w:eastAsia="Calibri" w:hAnsi="Calibri"/>
+                <w:color w:val="000000"/>
+              </w:rPr>
+            </w:pPr>
+            <w:r>
+              <w:rPr>
                 <w:rFonts w:ascii="Calibri" w:cs="Calibri" w:eastAsia="Calibri" w:hAnsi="Calibri"/>
                 <w:color w:val="000000"/>
                 <w:rtl w:val="0"/>
@@ -9812,6 +10078,25 @@
             </w:pPr>
             <w:r>
               <w:rPr>
+                <w:rFonts w:ascii="Calibri" w:hAnsi="Calibri" w:cs="Calibri" w:eastAsia="Calibri"/>
+                <w:b/>
+                <w:i w:val="0"/>
+                <w:color w:val="000000"/>
+                <w:sz w:val="24"/>
+              </w:rPr>
+              <w:t>☐</w:t>
+            </w:r>
+          </w:p>
+          <w:p>
+            <w:pPr>
+              <w:jc w:val="both"/>
+              <w:rPr>
+                <w:rFonts w:ascii="Calibri" w:cs="Calibri" w:eastAsia="Calibri" w:hAnsi="Calibri"/>
+                <w:color w:val="000000"/>
+              </w:rPr>
+            </w:pPr>
+            <w:r>
+              <w:rPr>
                 <w:rFonts w:ascii="Calibri" w:cs="Calibri" w:eastAsia="Calibri" w:hAnsi="Calibri"/>
                 <w:color w:val="000000"/>
                 <w:rtl w:val="0"/>
@@ -9822,6 +10107,25 @@
         </w:tc>
         <w:tc>
           <w:tcPr/>
+          <w:p>
+            <w:pPr>
+              <w:jc w:val="both"/>
+              <w:rPr>
+                <w:rFonts w:ascii="Calibri" w:cs="Calibri" w:eastAsia="Calibri" w:hAnsi="Calibri"/>
+                <w:color w:val="000000"/>
+              </w:rPr>
+            </w:pPr>
+            <w:r>
+              <w:rPr>
+                <w:rFonts w:ascii="Calibri" w:hAnsi="Calibri" w:cs="Calibri" w:eastAsia="Calibri"/>
+                <w:b/>
+                <w:i w:val="0"/>
+                <w:color w:val="000000"/>
+                <w:sz w:val="24"/>
+              </w:rPr>
+              <w:t>☐</w:t>
+            </w:r>
+          </w:p>
           <w:p>
             <w:pPr>
               <w:jc w:val="both"/>
@@ -9905,6 +10209,25 @@
             </w:pPr>
             <w:r>
               <w:rPr>
+                <w:rFonts w:ascii="Calibri" w:hAnsi="Calibri" w:cs="Calibri" w:eastAsia="Calibri"/>
+                <w:b/>
+                <w:i w:val="0"/>
+                <w:color w:val="000000"/>
+                <w:sz w:val="24"/>
+              </w:rPr>
+              <w:t>☐</w:t>
+            </w:r>
+          </w:p>
+          <w:p>
+            <w:pPr>
+              <w:jc w:val="both"/>
+              <w:rPr>
+                <w:rFonts w:ascii="Calibri" w:cs="Calibri" w:eastAsia="Calibri" w:hAnsi="Calibri"/>
+                <w:color w:val="000000"/>
+              </w:rPr>
+            </w:pPr>
+            <w:r>
+              <w:rPr>
                 <w:rFonts w:ascii="Calibri" w:cs="Calibri" w:eastAsia="Calibri" w:hAnsi="Calibri"/>
                 <w:color w:val="000000"/>
                 <w:rtl w:val="0"/>
@@ -9953,6 +10276,25 @@
             </w:pPr>
             <w:r>
               <w:rPr>
+                <w:rFonts w:ascii="Calibri" w:hAnsi="Calibri" w:cs="Calibri" w:eastAsia="Calibri"/>
+                <w:b/>
+                <w:i w:val="0"/>
+                <w:color w:val="000000"/>
+                <w:sz w:val="24"/>
+              </w:rPr>
+              <w:t>☒</w:t>
+            </w:r>
+          </w:p>
+          <w:p>
+            <w:pPr>
+              <w:jc w:val="both"/>
+              <w:rPr>
+                <w:rFonts w:ascii="Calibri" w:cs="Calibri" w:eastAsia="Calibri" w:hAnsi="Calibri"/>
+                <w:color w:val="000000"/>
+              </w:rPr>
+            </w:pPr>
+            <w:r>
+              <w:rPr>
                 <w:rFonts w:ascii="Calibri" w:cs="Calibri" w:eastAsia="Calibri" w:hAnsi="Calibri"/>
                 <w:color w:val="000000"/>
                 <w:rtl w:val="0"/>
@@ -9973,6 +10315,25 @@
             </w:pPr>
             <w:r>
               <w:rPr>
+                <w:rFonts w:ascii="Calibri" w:hAnsi="Calibri" w:cs="Calibri" w:eastAsia="Calibri"/>
+                <w:b/>
+                <w:i w:val="0"/>
+                <w:color w:val="000000"/>
+                <w:sz w:val="24"/>
+              </w:rPr>
+              <w:t>☐</w:t>
+            </w:r>
+          </w:p>
+          <w:p>
+            <w:pPr>
+              <w:jc w:val="both"/>
+              <w:rPr>
+                <w:rFonts w:ascii="Calibri" w:cs="Calibri" w:eastAsia="Calibri" w:hAnsi="Calibri"/>
+                <w:color w:val="000000"/>
+              </w:rPr>
+            </w:pPr>
+            <w:r>
+              <w:rPr>
                 <w:rFonts w:ascii="Calibri" w:cs="Calibri" w:eastAsia="Calibri" w:hAnsi="Calibri"/>
                 <w:color w:val="000000"/>
                 <w:rtl w:val="0"/>
@@ -9983,6 +10344,25 @@
         </w:tc>
         <w:tc>
           <w:tcPr/>
+          <w:p>
+            <w:pPr>
+              <w:jc w:val="both"/>
+              <w:rPr>
+                <w:rFonts w:ascii="Calibri" w:cs="Calibri" w:eastAsia="Calibri" w:hAnsi="Calibri"/>
+                <w:color w:val="000000"/>
+              </w:rPr>
+            </w:pPr>
+            <w:r>
+              <w:rPr>
+                <w:rFonts w:ascii="Calibri" w:hAnsi="Calibri" w:cs="Calibri" w:eastAsia="Calibri"/>
+                <w:b/>
+                <w:i w:val="0"/>
+                <w:color w:val="000000"/>
+                <w:sz w:val="24"/>
+              </w:rPr>
+              <w:t>☐</w:t>
+            </w:r>
+          </w:p>
           <w:p>
             <w:pPr>
               <w:jc w:val="both"/>
@@ -10066,6 +10446,25 @@
             </w:pPr>
             <w:r>
               <w:rPr>
+                <w:rFonts w:ascii="Calibri" w:hAnsi="Calibri" w:cs="Calibri" w:eastAsia="Calibri"/>
+                <w:b/>
+                <w:i w:val="0"/>
+                <w:color w:val="000000"/>
+                <w:sz w:val="24"/>
+              </w:rPr>
+              <w:t>☐</w:t>
+            </w:r>
+          </w:p>
+          <w:p>
+            <w:pPr>
+              <w:jc w:val="both"/>
+              <w:rPr>
+                <w:rFonts w:ascii="Calibri" w:cs="Calibri" w:eastAsia="Calibri" w:hAnsi="Calibri"/>
+                <w:color w:val="000000"/>
+              </w:rPr>
+            </w:pPr>
+            <w:r>
+              <w:rPr>
                 <w:rFonts w:ascii="Calibri" w:cs="Calibri" w:eastAsia="Calibri" w:hAnsi="Calibri"/>
                 <w:color w:val="000000"/>
                 <w:rtl w:val="0"/>
@@ -10086,6 +10485,25 @@
             </w:pPr>
             <w:r>
               <w:rPr>
+                <w:rFonts w:ascii="Calibri" w:hAnsi="Calibri" w:cs="Calibri" w:eastAsia="Calibri"/>
+                <w:b/>
+                <w:i w:val="0"/>
+                <w:color w:val="000000"/>
+                <w:sz w:val="24"/>
+              </w:rPr>
+              <w:t>☒</w:t>
+            </w:r>
+          </w:p>
+          <w:p>
+            <w:pPr>
+              <w:jc w:val="both"/>
+              <w:rPr>
+                <w:rFonts w:ascii="Calibri" w:cs="Calibri" w:eastAsia="Calibri" w:hAnsi="Calibri"/>
+                <w:color w:val="000000"/>
+              </w:rPr>
+            </w:pPr>
+            <w:r>
+              <w:rPr>
                 <w:rFonts w:ascii="Calibri" w:cs="Calibri" w:eastAsia="Calibri" w:hAnsi="Calibri"/>
                 <w:color w:val="000000"/>
                 <w:rtl w:val="0"/>
@@ -10106,6 +10524,25 @@
             </w:pPr>
             <w:r>
               <w:rPr>
+                <w:rFonts w:ascii="Calibri" w:hAnsi="Calibri" w:cs="Calibri" w:eastAsia="Calibri"/>
+                <w:b/>
+                <w:i w:val="0"/>
+                <w:color w:val="000000"/>
+                <w:sz w:val="24"/>
+              </w:rPr>
+              <w:t>☐</w:t>
+            </w:r>
+          </w:p>
+          <w:p>
+            <w:pPr>
+              <w:jc w:val="both"/>
+              <w:rPr>
+                <w:rFonts w:ascii="Calibri" w:cs="Calibri" w:eastAsia="Calibri" w:hAnsi="Calibri"/>
+                <w:color w:val="000000"/>
+              </w:rPr>
+            </w:pPr>
+            <w:r>
+              <w:rPr>
                 <w:rFonts w:ascii="Calibri" w:cs="Calibri" w:eastAsia="Calibri" w:hAnsi="Calibri"/>
                 <w:color w:val="000000"/>
                 <w:rtl w:val="0"/>
@@ -10116,6 +10553,25 @@
         </w:tc>
         <w:tc>
           <w:tcPr/>
+          <w:p>
+            <w:pPr>
+              <w:jc w:val="both"/>
+              <w:rPr>
+                <w:rFonts w:ascii="Calibri" w:cs="Calibri" w:eastAsia="Calibri" w:hAnsi="Calibri"/>
+                <w:color w:val="000000"/>
+              </w:rPr>
+            </w:pPr>
+            <w:r>
+              <w:rPr>
+                <w:rFonts w:ascii="Calibri" w:hAnsi="Calibri" w:cs="Calibri" w:eastAsia="Calibri"/>
+                <w:b/>
+                <w:i w:val="0"/>
+                <w:color w:val="000000"/>
+                <w:sz w:val="24"/>
+              </w:rPr>
+              <w:t>☐</w:t>
+            </w:r>
+          </w:p>
           <w:p>
             <w:pPr>
               <w:jc w:val="both"/>
@@ -10201,6 +10657,25 @@
             </w:pPr>
             <w:r>
               <w:rPr>
+                <w:rFonts w:ascii="Calibri" w:hAnsi="Calibri" w:cs="Calibri" w:eastAsia="Calibri"/>
+                <w:b/>
+                <w:i w:val="0"/>
+                <w:color w:val="000000"/>
+                <w:sz w:val="24"/>
+              </w:rPr>
+              <w:t>☐</w:t>
+            </w:r>
+          </w:p>
+          <w:p>
+            <w:pPr>
+              <w:jc w:val="both"/>
+              <w:rPr>
+                <w:rFonts w:ascii="Calibri" w:cs="Calibri" w:eastAsia="Calibri" w:hAnsi="Calibri"/>
+                <w:color w:val="000000"/>
+              </w:rPr>
+            </w:pPr>
+            <w:r>
+              <w:rPr>
                 <w:rFonts w:ascii="Calibri" w:cs="Calibri" w:eastAsia="Calibri" w:hAnsi="Calibri"/>
                 <w:color w:val="000000"/>
                 <w:rtl w:val="0"/>
@@ -10221,6 +10696,25 @@
             </w:pPr>
             <w:r>
               <w:rPr>
+                <w:rFonts w:ascii="Calibri" w:hAnsi="Calibri" w:cs="Calibri" w:eastAsia="Calibri"/>
+                <w:b/>
+                <w:i w:val="0"/>
+                <w:color w:val="000000"/>
+                <w:sz w:val="24"/>
+              </w:rPr>
+              <w:t>☒</w:t>
+            </w:r>
+          </w:p>
+          <w:p>
+            <w:pPr>
+              <w:jc w:val="both"/>
+              <w:rPr>
+                <w:rFonts w:ascii="Calibri" w:cs="Calibri" w:eastAsia="Calibri" w:hAnsi="Calibri"/>
+                <w:color w:val="000000"/>
+              </w:rPr>
+            </w:pPr>
+            <w:r>
+              <w:rPr>
                 <w:rFonts w:ascii="Calibri" w:cs="Calibri" w:eastAsia="Calibri" w:hAnsi="Calibri"/>
                 <w:color w:val="000000"/>
                 <w:rtl w:val="0"/>
@@ -10241,6 +10735,25 @@
             </w:pPr>
             <w:r>
               <w:rPr>
+                <w:rFonts w:ascii="Calibri" w:hAnsi="Calibri" w:cs="Calibri" w:eastAsia="Calibri"/>
+                <w:b/>
+                <w:i w:val="0"/>
+                <w:color w:val="000000"/>
+                <w:sz w:val="24"/>
+              </w:rPr>
+              <w:t>☐</w:t>
+            </w:r>
+          </w:p>
+          <w:p>
+            <w:pPr>
+              <w:jc w:val="both"/>
+              <w:rPr>
+                <w:rFonts w:ascii="Calibri" w:cs="Calibri" w:eastAsia="Calibri" w:hAnsi="Calibri"/>
+                <w:color w:val="000000"/>
+              </w:rPr>
+            </w:pPr>
+            <w:r>
+              <w:rPr>
                 <w:rFonts w:ascii="Calibri" w:cs="Calibri" w:eastAsia="Calibri" w:hAnsi="Calibri"/>
                 <w:color w:val="000000"/>
                 <w:rtl w:val="0"/>
@@ -10251,6 +10764,25 @@
         </w:tc>
         <w:tc>
           <w:tcPr/>
+          <w:p>
+            <w:pPr>
+              <w:jc w:val="both"/>
+              <w:rPr>
+                <w:rFonts w:ascii="Calibri" w:cs="Calibri" w:eastAsia="Calibri" w:hAnsi="Calibri"/>
+                <w:color w:val="000000"/>
+              </w:rPr>
+            </w:pPr>
+            <w:r>
+              <w:rPr>
+                <w:rFonts w:ascii="Calibri" w:hAnsi="Calibri" w:cs="Calibri" w:eastAsia="Calibri"/>
+                <w:b/>
+                <w:i w:val="0"/>
+                <w:color w:val="000000"/>
+                <w:sz w:val="24"/>
+              </w:rPr>
+              <w:t>☐</w:t>
+            </w:r>
+          </w:p>
           <w:p>
             <w:pPr>
               <w:jc w:val="both"/>
@@ -10403,6 +10935,20 @@
             </w:pPr>
             <w:r>
               <w:rPr>
+                <w:rFonts w:ascii="Calibri" w:hAnsi="Calibri" w:cs="Calibri" w:eastAsia="Calibri"/>
+                <w:b/>
+                <w:i w:val="0"/>
+                <w:color w:val="000000"/>
+                <w:sz w:val="24"/>
+              </w:rPr>
+              <w:t>☐</w:t>
+            </w:r>
+          </w:p>
+          <w:p>
+            <w:pPr>
+              <w:spacing w:after="0" w:line="240" w:lineRule="auto"/>
+              <w:jc w:val="both"/>
+              <w:rPr>
                 <w:rFonts w:ascii="Calibri" w:cs="Calibri" w:eastAsia="Calibri" w:hAnsi="Calibri"/>
                 <w:b w:val="0"/>
                 <w:bCs w:val="0"/>
@@ -10412,6 +10958,19 @@
                 <w:color w:val="000000"/>
                 <w:sz w:val="20"/>
                 <w:szCs w:val="20"/>
+              </w:rPr>
+            </w:pPr>
+            <w:r>
+              <w:rPr>
+                <w:rFonts w:ascii="Calibri" w:cs="Calibri" w:eastAsia="Calibri" w:hAnsi="Calibri"/>
+                <w:b w:val="0"/>
+                <w:bCs w:val="0"/>
+                <w:i w:val="0"/>
+                <w:iCs w:val="0"/>
+                <w:smallCaps w:val="0"/>
+                <w:color w:val="000000"/>
+                <w:sz w:val="20"/>
+                <w:szCs w:val="20"/>
                 <w:rtl w:val="0"/>
               </w:rPr>
               <w:t xml:space="preserve">Redacta los apartados solicitados en inglés, comunicando en un 100% en un nivel intermedio alto según lo solicitado.</w:t>
@@ -10438,6 +10997,20 @@
             </w:pPr>
             <w:r>
               <w:rPr>
+                <w:rFonts w:ascii="Calibri" w:hAnsi="Calibri" w:cs="Calibri" w:eastAsia="Calibri"/>
+                <w:b/>
+                <w:i w:val="0"/>
+                <w:color w:val="000000"/>
+                <w:sz w:val="24"/>
+              </w:rPr>
+              <w:t>☒</w:t>
+            </w:r>
+          </w:p>
+          <w:p>
+            <w:pPr>
+              <w:spacing w:after="0" w:line="240" w:lineRule="auto"/>
+              <w:jc w:val="both"/>
+              <w:rPr>
                 <w:rFonts w:ascii="Calibri" w:cs="Calibri" w:eastAsia="Calibri" w:hAnsi="Calibri"/>
                 <w:b w:val="0"/>
                 <w:bCs w:val="0"/>
@@ -10447,6 +11020,19 @@
                 <w:color w:val="000000"/>
                 <w:sz w:val="20"/>
                 <w:szCs w:val="20"/>
+              </w:rPr>
+            </w:pPr>
+            <w:r>
+              <w:rPr>
+                <w:rFonts w:ascii="Calibri" w:cs="Calibri" w:eastAsia="Calibri" w:hAnsi="Calibri"/>
+                <w:b w:val="0"/>
+                <w:bCs w:val="0"/>
+                <w:i w:val="0"/>
+                <w:iCs w:val="0"/>
+                <w:smallCaps w:val="0"/>
+                <w:color w:val="000000"/>
+                <w:sz w:val="20"/>
+                <w:szCs w:val="20"/>
                 <w:rtl w:val="0"/>
               </w:rPr>
               <w:t xml:space="preserve">Redacta los apartados solicitados en inglés, comunicando en un 60% en un nivel intermedio alto según lo solicitado.</w:t>
@@ -10495,6 +11081,20 @@
             </w:pPr>
             <w:r>
               <w:rPr>
+                <w:rFonts w:ascii="Calibri" w:hAnsi="Calibri" w:cs="Calibri" w:eastAsia="Calibri"/>
+                <w:b/>
+                <w:i w:val="0"/>
+                <w:color w:val="000000"/>
+                <w:sz w:val="24"/>
+              </w:rPr>
+              <w:t>☐</w:t>
+            </w:r>
+          </w:p>
+          <w:p>
+            <w:pPr>
+              <w:spacing w:after="0" w:line="240" w:lineRule="auto"/>
+              <w:jc w:val="both"/>
+              <w:rPr>
                 <w:rFonts w:ascii="Calibri" w:cs="Calibri" w:eastAsia="Calibri" w:hAnsi="Calibri"/>
                 <w:b w:val="0"/>
                 <w:bCs w:val="0"/>
@@ -10504,6 +11104,19 @@
                 <w:color w:val="000000"/>
                 <w:sz w:val="20"/>
                 <w:szCs w:val="20"/>
+              </w:rPr>
+            </w:pPr>
+            <w:r>
+              <w:rPr>
+                <w:rFonts w:ascii="Calibri" w:cs="Calibri" w:eastAsia="Calibri" w:hAnsi="Calibri"/>
+                <w:b w:val="0"/>
+                <w:bCs w:val="0"/>
+                <w:i w:val="0"/>
+                <w:iCs w:val="0"/>
+                <w:smallCaps w:val="0"/>
+                <w:color w:val="000000"/>
+                <w:sz w:val="20"/>
+                <w:szCs w:val="20"/>
                 <w:rtl w:val="0"/>
               </w:rPr>
               <w:t xml:space="preserve">Redacta los apartados solicitados en inglés, comunicando en un 30% en un nivel intermedio alto lo solicitado.</w:t>
@@ -10534,6 +11147,33 @@
         </w:tc>
         <w:tc>
           <w:tcPr/>
+          <w:p>
+            <w:pPr>
+              <w:spacing w:after="0" w:line="240" w:lineRule="auto"/>
+              <w:jc w:val="both"/>
+              <w:rPr>
+                <w:rFonts w:ascii="Calibri" w:cs="Calibri" w:eastAsia="Calibri" w:hAnsi="Calibri"/>
+                <w:b w:val="0"/>
+                <w:bCs w:val="0"/>
+                <w:i w:val="0"/>
+                <w:iCs w:val="0"/>
+                <w:smallCaps w:val="0"/>
+                <w:color w:val="000000"/>
+                <w:sz w:val="20"/>
+                <w:szCs w:val="20"/>
+              </w:rPr>
+            </w:pPr>
+            <w:r>
+              <w:rPr>
+                <w:rFonts w:ascii="Calibri" w:hAnsi="Calibri" w:cs="Calibri" w:eastAsia="Calibri"/>
+                <w:b/>
+                <w:i w:val="0"/>
+                <w:color w:val="000000"/>
+                <w:sz w:val="24"/>
+              </w:rPr>
+              <w:t>☐</w:t>
+            </w:r>
+          </w:p>
           <w:p>
             <w:pPr>
               <w:spacing w:after="0" w:line="240" w:lineRule="auto"/>
@@ -10671,6 +11311,2333 @@
         <w:rPr>
           <w:rtl w:val="0"/>
         </w:rPr>
+      </w:r>
+    </w:p>
+    <w:p>
+      <w:r>
+        <w:br w:type="page"/>
+      </w:r>
+    </w:p>
+    <w:p>
+      <w:pPr>
+        <w:spacing w:after="80"/>
+      </w:pPr>
+      <w:r>
+        <w:rPr>
+          <w:rFonts w:ascii="Calibri" w:hAnsi="Calibri" w:cs="Calibri" w:eastAsia="Calibri"/>
+          <w:b/>
+          <w:i w:val="0"/>
+          <w:color w:val="1F3864"/>
+          <w:sz w:val="28"/>
+        </w:rPr>
+        <w:t>Resultado de la autoevaluación</w:t>
+      </w:r>
+    </w:p>
+    <w:p>
+      <w:pPr>
+        <w:spacing w:after="120"/>
+      </w:pPr>
+      <w:r>
+        <w:rPr>
+          <w:rFonts w:ascii="Calibri" w:hAnsi="Calibri" w:cs="Calibri" w:eastAsia="Calibri"/>
+          <w:b/>
+          <w:i w:val="0"/>
+          <w:color w:val="000000"/>
+          <w:sz w:val="22"/>
+        </w:rPr>
+        <w:t xml:space="preserve">Estudiante: </w:t>
+      </w:r>
+      <w:r>
+        <w:rPr>
+          <w:rFonts w:ascii="Calibri" w:hAnsi="Calibri" w:cs="Calibri" w:eastAsia="Calibri"/>
+          <w:b w:val="0"/>
+          <w:i w:val="0"/>
+          <w:color w:val="000000"/>
+          <w:sz w:val="22"/>
+        </w:rPr>
+        <w:t xml:space="preserve">Iahn Vera · </w:t>
+      </w:r>
+      <w:r>
+        <w:rPr>
+          <w:rFonts w:ascii="Calibri" w:hAnsi="Calibri" w:cs="Calibri" w:eastAsia="Calibri"/>
+          <w:b/>
+          <w:i w:val="0"/>
+          <w:color w:val="000000"/>
+          <w:sz w:val="22"/>
+        </w:rPr>
+        <w:t xml:space="preserve">Proyecto APT: </w:t>
+      </w:r>
+      <w:r>
+        <w:rPr>
+          <w:rFonts w:ascii="Calibri" w:hAnsi="Calibri" w:cs="Calibri" w:eastAsia="Calibri"/>
+          <w:b w:val="0"/>
+          <w:i w:val="0"/>
+          <w:color w:val="000000"/>
+          <w:sz w:val="22"/>
+        </w:rPr>
+        <w:t xml:space="preserve">CascoVision — Sistema de detección automatizada de EPP mediante visión computacional · </w:t>
+      </w:r>
+      <w:r>
+        <w:rPr>
+          <w:rFonts w:ascii="Calibri" w:hAnsi="Calibri" w:cs="Calibri" w:eastAsia="Calibri"/>
+          <w:b/>
+          <w:i w:val="0"/>
+          <w:color w:val="000000"/>
+          <w:sz w:val="22"/>
+        </w:rPr>
+        <w:t xml:space="preserve">Fecha: </w:t>
+      </w:r>
+      <w:r>
+        <w:rPr>
+          <w:rFonts w:ascii="Calibri" w:hAnsi="Calibri" w:cs="Calibri" w:eastAsia="Calibri"/>
+          <w:b w:val="0"/>
+          <w:i w:val="0"/>
+          <w:color w:val="000000"/>
+          <w:sz w:val="22"/>
+        </w:rPr>
+        <w:t>15 de octubre de 2026 (semana 10), período 2026.02</w:t>
+      </w:r>
+    </w:p>
+    <w:p>
+      <w:pPr>
+        <w:spacing w:after="120"/>
+      </w:pPr>
+      <w:r>
+        <w:rPr>
+          <w:rFonts w:ascii="Calibri" w:hAnsi="Calibri" w:cs="Calibri" w:eastAsia="Calibri"/>
+          <w:b w:val="0"/>
+          <w:i w:val="0"/>
+          <w:color w:val="000000"/>
+          <w:sz w:val="22"/>
+        </w:rPr>
+        <w:t>Evaluación formativa, sin ponderación sobre la nota final. Me autoevalúo contra el informe de avance del equipo (guía 2.4) y contra el repositorio oficial, porque 60 de los 100 puntos de la evaluación sumativa de avance se verifican en Git. El propósito es identificar qué debemos ajustar antes de esa evaluación.</w:t>
+      </w:r>
+    </w:p>
+    <w:p>
+      <w:pPr>
+        <w:spacing w:after="120"/>
+      </w:pPr>
+      <w:r>
+        <w:rPr>
+          <w:rFonts w:ascii="Calibri" w:hAnsi="Calibri" w:cs="Calibri" w:eastAsia="Calibri"/>
+          <w:b w:val="0"/>
+          <w:i w:val="0"/>
+          <w:color w:val="000000"/>
+          <w:sz w:val="22"/>
+        </w:rPr>
+      </w:r>
+    </w:p>
+    <w:tbl>
+      <w:tblPr>
+        <w:tblW w:type="auto" w:w="0"/>
+        <w:jc w:val="center"/>
+        <w:tblBorders>
+          <w:top w:val="single" w:sz="4" w:space="0" w:color="7F7F7F"/>
+          <w:left w:val="single" w:sz="4" w:space="0" w:color="7F7F7F"/>
+          <w:bottom w:val="single" w:sz="4" w:space="0" w:color="7F7F7F"/>
+          <w:right w:val="single" w:sz="4" w:space="0" w:color="7F7F7F"/>
+          <w:insideH w:val="single" w:sz="4" w:space="0" w:color="7F7F7F"/>
+          <w:insideV w:val="single" w:sz="4" w:space="0" w:color="7F7F7F"/>
+        </w:tblBorders>
+        <w:tblLayout w:type="fixed"/>
+        <w:tblLook w:firstColumn="1" w:firstRow="1" w:lastColumn="0" w:lastRow="0" w:noHBand="0" w:noVBand="1" w:val="04A0"/>
+      </w:tblPr>
+      <w:tblGrid>
+        <w:gridCol w:w="2835"/>
+        <w:gridCol w:w="1531"/>
+        <w:gridCol w:w="1417"/>
+        <w:gridCol w:w="1020"/>
+        <w:gridCol w:w="6180"/>
+      </w:tblGrid>
+      <w:tr>
+        <w:trPr>
+          <w:tblHeader w:val="true"/>
+        </w:trPr>
+        <w:tc>
+          <w:tcPr>
+            <w:tcW w:type="dxa" w:w="2835"/>
+            <w:shd w:val="clear" w:color="auto" w:fill="1F3864"/>
+          </w:tcPr>
+          <w:p>
+            <w:r>
+              <w:rPr>
+                <w:rFonts w:ascii="Calibri" w:hAnsi="Calibri" w:cs="Calibri" w:eastAsia="Calibri"/>
+                <w:b/>
+                <w:i w:val="0"/>
+                <w:color w:val="FFFFFF"/>
+                <w:sz w:val="20"/>
+              </w:rPr>
+              <w:t>Indicador de evaluación</w:t>
+            </w:r>
+          </w:p>
+        </w:tc>
+        <w:tc>
+          <w:tcPr>
+            <w:tcW w:type="dxa" w:w="1531"/>
+            <w:shd w:val="clear" w:color="auto" w:fill="1F3864"/>
+          </w:tcPr>
+          <w:p>
+            <w:r>
+              <w:rPr>
+                <w:rFonts w:ascii="Calibri" w:hAnsi="Calibri" w:cs="Calibri" w:eastAsia="Calibri"/>
+                <w:b/>
+                <w:i w:val="0"/>
+                <w:color w:val="FFFFFF"/>
+                <w:sz w:val="20"/>
+              </w:rPr>
+              <w:t>Nivel autoevaluado</w:t>
+            </w:r>
+          </w:p>
+        </w:tc>
+        <w:tc>
+          <w:tcPr>
+            <w:tcW w:type="dxa" w:w="1417"/>
+            <w:shd w:val="clear" w:color="auto" w:fill="1F3864"/>
+          </w:tcPr>
+          <w:p>
+            <w:r>
+              <w:rPr>
+                <w:rFonts w:ascii="Calibri" w:hAnsi="Calibri" w:cs="Calibri" w:eastAsia="Calibri"/>
+                <w:b/>
+                <w:i w:val="0"/>
+                <w:color w:val="FFFFFF"/>
+                <w:sz w:val="20"/>
+              </w:rPr>
+              <w:t>Ponderación</w:t>
+            </w:r>
+          </w:p>
+        </w:tc>
+        <w:tc>
+          <w:tcPr>
+            <w:tcW w:type="dxa" w:w="1020"/>
+            <w:shd w:val="clear" w:color="auto" w:fill="1F3864"/>
+          </w:tcPr>
+          <w:p>
+            <w:r>
+              <w:rPr>
+                <w:rFonts w:ascii="Calibri" w:hAnsi="Calibri" w:cs="Calibri" w:eastAsia="Calibri"/>
+                <w:b/>
+                <w:i w:val="0"/>
+                <w:color w:val="FFFFFF"/>
+                <w:sz w:val="20"/>
+              </w:rPr>
+              <w:t>Puntaje</w:t>
+            </w:r>
+          </w:p>
+        </w:tc>
+        <w:tc>
+          <w:tcPr>
+            <w:tcW w:type="dxa" w:w="6180"/>
+            <w:shd w:val="clear" w:color="auto" w:fill="1F3864"/>
+          </w:tcPr>
+          <w:p>
+            <w:r>
+              <w:rPr>
+                <w:rFonts w:ascii="Calibri" w:hAnsi="Calibri" w:cs="Calibri" w:eastAsia="Calibri"/>
+                <w:b/>
+                <w:i w:val="0"/>
+                <w:color w:val="FFFFFF"/>
+                <w:sz w:val="20"/>
+              </w:rPr>
+              <w:t>Justificación de la autoevaluación</w:t>
+            </w:r>
+          </w:p>
+        </w:tc>
+      </w:tr>
+      <w:tr>
+        <w:tc>
+          <w:tcPr>
+            <w:tcW w:type="dxa" w:w="2835"/>
+          </w:tcPr>
+          <w:p>
+            <w:r>
+              <w:rPr>
+                <w:rFonts w:ascii="Calibri" w:hAnsi="Calibri" w:cs="Calibri" w:eastAsia="Calibri"/>
+                <w:b w:val="0"/>
+                <w:i w:val="0"/>
+                <w:color w:val="000000"/>
+                <w:sz w:val="20"/>
+              </w:rPr>
+              <w:t>1. Propone ajustes considerando dificultades, facilitadores y retroalimentación.</w:t>
+            </w:r>
+          </w:p>
+        </w:tc>
+        <w:tc>
+          <w:tcPr>
+            <w:tcW w:type="dxa" w:w="1531"/>
+          </w:tcPr>
+          <w:p>
+            <w:r>
+              <w:rPr>
+                <w:rFonts w:ascii="Calibri" w:hAnsi="Calibri" w:cs="Calibri" w:eastAsia="Calibri"/>
+                <w:b w:val="0"/>
+                <w:i w:val="0"/>
+                <w:color w:val="000000"/>
+                <w:sz w:val="20"/>
+              </w:rPr>
+              <w:t>Completamente logrado</w:t>
+            </w:r>
+          </w:p>
+        </w:tc>
+        <w:tc>
+          <w:tcPr>
+            <w:tcW w:type="dxa" w:w="1417"/>
+          </w:tcPr>
+          <w:p>
+            <w:r>
+              <w:rPr>
+                <w:rFonts w:ascii="Calibri" w:hAnsi="Calibri" w:cs="Calibri" w:eastAsia="Calibri"/>
+                <w:b w:val="0"/>
+                <w:i w:val="0"/>
+                <w:color w:val="000000"/>
+                <w:sz w:val="20"/>
+              </w:rPr>
+              <w:t>20</w:t>
+            </w:r>
+          </w:p>
+        </w:tc>
+        <w:tc>
+          <w:tcPr>
+            <w:tcW w:type="dxa" w:w="1020"/>
+          </w:tcPr>
+          <w:p>
+            <w:r>
+              <w:rPr>
+                <w:rFonts w:ascii="Calibri" w:hAnsi="Calibri" w:cs="Calibri" w:eastAsia="Calibri"/>
+                <w:b w:val="0"/>
+                <w:i w:val="0"/>
+                <w:color w:val="000000"/>
+                <w:sz w:val="20"/>
+              </w:rPr>
+              <w:t>20</w:t>
+            </w:r>
+          </w:p>
+        </w:tc>
+        <w:tc>
+          <w:tcPr>
+            <w:tcW w:type="dxa" w:w="6180"/>
+          </w:tcPr>
+          <w:p>
+            <w:r>
+              <w:rPr>
+                <w:rFonts w:ascii="Calibri" w:hAnsi="Calibri" w:cs="Calibri" w:eastAsia="Calibri"/>
+                <w:b w:val="0"/>
+                <w:i w:val="0"/>
+                <w:color w:val="000000"/>
+                <w:sz w:val="20"/>
+              </w:rPr>
+              <w:t>Los ajustes están justificados con las tres fuentes: retroalimentación del docente (F6: de incremental a cascada; F8: más riesgos), dificultades (dataset sin clase no_vest, hardware en tránsito, trabajo duplicado) y facilitadores (proyecto ya evaluado, dataset público). Están escritos en la guía 2.4.</w:t>
+            </w:r>
+          </w:p>
+        </w:tc>
+      </w:tr>
+      <w:tr>
+        <w:tc>
+          <w:tcPr>
+            <w:tcW w:type="dxa" w:w="2835"/>
+            <w:shd w:val="clear" w:color="auto" w:fill="F2F2F2"/>
+          </w:tcPr>
+          <w:p>
+            <w:r>
+              <w:rPr>
+                <w:rFonts w:ascii="Calibri" w:hAnsi="Calibri" w:cs="Calibri" w:eastAsia="Calibri"/>
+                <w:b w:val="0"/>
+                <w:i w:val="0"/>
+                <w:color w:val="000000"/>
+                <w:sz w:val="20"/>
+              </w:rPr>
+              <w:t>2. Aplica una metodología que permite el logro de los objetivos propuestos.</w:t>
+            </w:r>
+          </w:p>
+        </w:tc>
+        <w:tc>
+          <w:tcPr>
+            <w:tcW w:type="dxa" w:w="1531"/>
+            <w:shd w:val="clear" w:color="auto" w:fill="F2F2F2"/>
+          </w:tcPr>
+          <w:p>
+            <w:r>
+              <w:rPr>
+                <w:rFonts w:ascii="Calibri" w:hAnsi="Calibri" w:cs="Calibri" w:eastAsia="Calibri"/>
+                <w:b w:val="0"/>
+                <w:i w:val="0"/>
+                <w:color w:val="000000"/>
+                <w:sz w:val="20"/>
+              </w:rPr>
+              <w:t>Logrado</w:t>
+            </w:r>
+          </w:p>
+        </w:tc>
+        <w:tc>
+          <w:tcPr>
+            <w:tcW w:type="dxa" w:w="1417"/>
+            <w:shd w:val="clear" w:color="auto" w:fill="F2F2F2"/>
+          </w:tcPr>
+          <w:p>
+            <w:r>
+              <w:rPr>
+                <w:rFonts w:ascii="Calibri" w:hAnsi="Calibri" w:cs="Calibri" w:eastAsia="Calibri"/>
+                <w:b w:val="0"/>
+                <w:i w:val="0"/>
+                <w:color w:val="000000"/>
+                <w:sz w:val="20"/>
+              </w:rPr>
+              <w:t>20</w:t>
+            </w:r>
+          </w:p>
+        </w:tc>
+        <w:tc>
+          <w:tcPr>
+            <w:tcW w:type="dxa" w:w="1020"/>
+            <w:shd w:val="clear" w:color="auto" w:fill="F2F2F2"/>
+          </w:tcPr>
+          <w:p>
+            <w:r>
+              <w:rPr>
+                <w:rFonts w:ascii="Calibri" w:hAnsi="Calibri" w:cs="Calibri" w:eastAsia="Calibri"/>
+                <w:b w:val="0"/>
+                <w:i w:val="0"/>
+                <w:color w:val="000000"/>
+                <w:sz w:val="20"/>
+              </w:rPr>
+              <w:t>12</w:t>
+            </w:r>
+          </w:p>
+        </w:tc>
+        <w:tc>
+          <w:tcPr>
+            <w:tcW w:type="dxa" w:w="6180"/>
+            <w:shd w:val="clear" w:color="auto" w:fill="F2F2F2"/>
+          </w:tcPr>
+          <w:p>
+            <w:r>
+              <w:rPr>
+                <w:rFonts w:ascii="Calibri" w:hAnsi="Calibri" w:cs="Calibri" w:eastAsia="Calibri"/>
+                <w:b w:val="0"/>
+                <w:i w:val="0"/>
+                <w:color w:val="000000"/>
+                <w:sz w:val="20"/>
+              </w:rPr>
+              <w:t>La cascada con puertas de fase está aplicada y documentada en la Gantt, pero dos puertas no se han cerrado: el SRS sigue sin aprobación formal (v0.3) y el documento de diseño (D2) no existe consolidado. Por eso no se observa el cumplimiento completo de los objetivos del avance.</w:t>
+            </w:r>
+          </w:p>
+        </w:tc>
+      </w:tr>
+      <w:tr>
+        <w:tc>
+          <w:tcPr>
+            <w:tcW w:type="dxa" w:w="2835"/>
+          </w:tcPr>
+          <w:p>
+            <w:r>
+              <w:rPr>
+                <w:rFonts w:ascii="Calibri" w:hAnsi="Calibri" w:cs="Calibri" w:eastAsia="Calibri"/>
+                <w:b w:val="0"/>
+                <w:i w:val="0"/>
+                <w:color w:val="000000"/>
+                <w:sz w:val="20"/>
+              </w:rPr>
+              <w:t>3. Genera evidencias que dan cuenta del avance del Proyecto APT.</w:t>
+            </w:r>
+          </w:p>
+        </w:tc>
+        <w:tc>
+          <w:tcPr>
+            <w:tcW w:type="dxa" w:w="1531"/>
+          </w:tcPr>
+          <w:p>
+            <w:r>
+              <w:rPr>
+                <w:rFonts w:ascii="Calibri" w:hAnsi="Calibri" w:cs="Calibri" w:eastAsia="Calibri"/>
+                <w:b w:val="0"/>
+                <w:i w:val="0"/>
+                <w:color w:val="000000"/>
+                <w:sz w:val="20"/>
+              </w:rPr>
+              <w:t>Logrado</w:t>
+            </w:r>
+          </w:p>
+        </w:tc>
+        <w:tc>
+          <w:tcPr>
+            <w:tcW w:type="dxa" w:w="1417"/>
+          </w:tcPr>
+          <w:p>
+            <w:r>
+              <w:rPr>
+                <w:rFonts w:ascii="Calibri" w:hAnsi="Calibri" w:cs="Calibri" w:eastAsia="Calibri"/>
+                <w:b w:val="0"/>
+                <w:i w:val="0"/>
+                <w:color w:val="000000"/>
+                <w:sz w:val="20"/>
+              </w:rPr>
+              <w:t>25</w:t>
+            </w:r>
+          </w:p>
+        </w:tc>
+        <w:tc>
+          <w:tcPr>
+            <w:tcW w:type="dxa" w:w="1020"/>
+          </w:tcPr>
+          <w:p>
+            <w:r>
+              <w:rPr>
+                <w:rFonts w:ascii="Calibri" w:hAnsi="Calibri" w:cs="Calibri" w:eastAsia="Calibri"/>
+                <w:b w:val="0"/>
+                <w:i w:val="0"/>
+                <w:color w:val="000000"/>
+                <w:sz w:val="20"/>
+              </w:rPr>
+              <w:t>15</w:t>
+            </w:r>
+          </w:p>
+        </w:tc>
+        <w:tc>
+          <w:tcPr>
+            <w:tcW w:type="dxa" w:w="6180"/>
+          </w:tcPr>
+          <w:p>
+            <w:r>
+              <w:rPr>
+                <w:rFonts w:ascii="Calibri" w:hAnsi="Calibri" w:cs="Calibri" w:eastAsia="Calibri"/>
+                <w:b w:val="0"/>
+                <w:i w:val="0"/>
+                <w:color w:val="000000"/>
+                <w:sz w:val="20"/>
+              </w:rPr>
+              <w:t>Hay evidencias de documentación (SRS, Gantt, casos de uso, contrato de API), de programación (API FastAPI con pruebas, motor de detección con difuminado facial) y de datos (modelo entrenado con métricas y migración PostgreSQL). Requieren ajustes: el modelo está bajo el umbral del SRS, la persistencia está en una rama sin integrar y no hay Docker.</w:t>
+            </w:r>
+          </w:p>
+        </w:tc>
+      </w:tr>
+      <w:tr>
+        <w:tc>
+          <w:tcPr>
+            <w:tcW w:type="dxa" w:w="2835"/>
+            <w:shd w:val="clear" w:color="auto" w:fill="F2F2F2"/>
+          </w:tcPr>
+          <w:p>
+            <w:r>
+              <w:rPr>
+                <w:rFonts w:ascii="Calibri" w:hAnsi="Calibri" w:cs="Calibri" w:eastAsia="Calibri"/>
+                <w:b w:val="0"/>
+                <w:i w:val="0"/>
+                <w:color w:val="000000"/>
+                <w:sz w:val="20"/>
+              </w:rPr>
+              <w:t>4. Utiliza de manera precisa el lenguaje técnico.</w:t>
+            </w:r>
+          </w:p>
+        </w:tc>
+        <w:tc>
+          <w:tcPr>
+            <w:tcW w:type="dxa" w:w="1531"/>
+            <w:shd w:val="clear" w:color="auto" w:fill="F2F2F2"/>
+          </w:tcPr>
+          <w:p>
+            <w:r>
+              <w:rPr>
+                <w:rFonts w:ascii="Calibri" w:hAnsi="Calibri" w:cs="Calibri" w:eastAsia="Calibri"/>
+                <w:b w:val="0"/>
+                <w:i w:val="0"/>
+                <w:color w:val="000000"/>
+                <w:sz w:val="20"/>
+              </w:rPr>
+              <w:t>Completamente logrado</w:t>
+            </w:r>
+          </w:p>
+        </w:tc>
+        <w:tc>
+          <w:tcPr>
+            <w:tcW w:type="dxa" w:w="1417"/>
+            <w:shd w:val="clear" w:color="auto" w:fill="F2F2F2"/>
+          </w:tcPr>
+          <w:p>
+            <w:r>
+              <w:rPr>
+                <w:rFonts w:ascii="Calibri" w:hAnsi="Calibri" w:cs="Calibri" w:eastAsia="Calibri"/>
+                <w:b w:val="0"/>
+                <w:i w:val="0"/>
+                <w:color w:val="000000"/>
+                <w:sz w:val="20"/>
+              </w:rPr>
+              <w:t>5</w:t>
+            </w:r>
+          </w:p>
+        </w:tc>
+        <w:tc>
+          <w:tcPr>
+            <w:tcW w:type="dxa" w:w="1020"/>
+            <w:shd w:val="clear" w:color="auto" w:fill="F2F2F2"/>
+          </w:tcPr>
+          <w:p>
+            <w:r>
+              <w:rPr>
+                <w:rFonts w:ascii="Calibri" w:hAnsi="Calibri" w:cs="Calibri" w:eastAsia="Calibri"/>
+                <w:b w:val="0"/>
+                <w:i w:val="0"/>
+                <w:color w:val="000000"/>
+                <w:sz w:val="20"/>
+              </w:rPr>
+              <w:t>5</w:t>
+            </w:r>
+          </w:p>
+        </w:tc>
+        <w:tc>
+          <w:tcPr>
+            <w:tcW w:type="dxa" w:w="6180"/>
+            <w:shd w:val="clear" w:color="auto" w:fill="F2F2F2"/>
+          </w:tcPr>
+          <w:p>
+            <w:r>
+              <w:rPr>
+                <w:rFonts w:ascii="Calibri" w:hAnsi="Calibri" w:cs="Calibri" w:eastAsia="Calibri"/>
+                <w:b w:val="0"/>
+                <w:i w:val="0"/>
+                <w:color w:val="000000"/>
+                <w:sz w:val="20"/>
+              </w:rPr>
+              <w:t>Se usa la terminología de la disciplina con precisión: puertas de fase, RNF, mAP@0,5, recall, migraciones, endpoint, token, inferencia en el borde (Edge) y ONNX.</w:t>
+            </w:r>
+          </w:p>
+        </w:tc>
+      </w:tr>
+      <w:tr>
+        <w:tc>
+          <w:tcPr>
+            <w:tcW w:type="dxa" w:w="2835"/>
+          </w:tcPr>
+          <w:p>
+            <w:r>
+              <w:rPr>
+                <w:rFonts w:ascii="Calibri" w:hAnsi="Calibri" w:cs="Calibri" w:eastAsia="Calibri"/>
+                <w:b w:val="0"/>
+                <w:i w:val="0"/>
+                <w:color w:val="000000"/>
+                <w:sz w:val="20"/>
+              </w:rPr>
+              <w:t>5. Utiliza reglas de redacción, ortografía y normas de citas y referencias.</w:t>
+            </w:r>
+          </w:p>
+        </w:tc>
+        <w:tc>
+          <w:tcPr>
+            <w:tcW w:type="dxa" w:w="1531"/>
+          </w:tcPr>
+          <w:p>
+            <w:r>
+              <w:rPr>
+                <w:rFonts w:ascii="Calibri" w:hAnsi="Calibri" w:cs="Calibri" w:eastAsia="Calibri"/>
+                <w:b w:val="0"/>
+                <w:i w:val="0"/>
+                <w:color w:val="000000"/>
+                <w:sz w:val="20"/>
+              </w:rPr>
+              <w:t>Logrado</w:t>
+            </w:r>
+          </w:p>
+        </w:tc>
+        <w:tc>
+          <w:tcPr>
+            <w:tcW w:type="dxa" w:w="1417"/>
+          </w:tcPr>
+          <w:p>
+            <w:r>
+              <w:rPr>
+                <w:rFonts w:ascii="Calibri" w:hAnsi="Calibri" w:cs="Calibri" w:eastAsia="Calibri"/>
+                <w:b w:val="0"/>
+                <w:i w:val="0"/>
+                <w:color w:val="000000"/>
+                <w:sz w:val="20"/>
+              </w:rPr>
+              <w:t>5</w:t>
+            </w:r>
+          </w:p>
+        </w:tc>
+        <w:tc>
+          <w:tcPr>
+            <w:tcW w:type="dxa" w:w="1020"/>
+          </w:tcPr>
+          <w:p>
+            <w:r>
+              <w:rPr>
+                <w:rFonts w:ascii="Calibri" w:hAnsi="Calibri" w:cs="Calibri" w:eastAsia="Calibri"/>
+                <w:b w:val="0"/>
+                <w:i w:val="0"/>
+                <w:color w:val="000000"/>
+                <w:sz w:val="20"/>
+              </w:rPr>
+              <w:t>3</w:t>
+            </w:r>
+          </w:p>
+        </w:tc>
+        <w:tc>
+          <w:tcPr>
+            <w:tcW w:type="dxa" w:w="6180"/>
+          </w:tcPr>
+          <w:p>
+            <w:r>
+              <w:rPr>
+                <w:rFonts w:ascii="Calibri" w:hAnsi="Calibri" w:cs="Calibri" w:eastAsia="Calibri"/>
+                <w:b w:val="0"/>
+                <w:i w:val="0"/>
+                <w:color w:val="000000"/>
+                <w:sz w:val="20"/>
+              </w:rPr>
+              <w:t>La redacción está revisada, pero las referencias en APA 7 recién se incorporaron al informe y todavía hay que verificar que cada cita del texto tenga su entrada. Hasta revisarlo, asumo entre 1 y 5 errores.</w:t>
+            </w:r>
+          </w:p>
+        </w:tc>
+      </w:tr>
+      <w:tr>
+        <w:tc>
+          <w:tcPr>
+            <w:tcW w:type="dxa" w:w="2835"/>
+            <w:shd w:val="clear" w:color="auto" w:fill="F2F2F2"/>
+          </w:tcPr>
+          <w:p>
+            <w:r>
+              <w:rPr>
+                <w:rFonts w:ascii="Calibri" w:hAnsi="Calibri" w:cs="Calibri" w:eastAsia="Calibri"/>
+                <w:b w:val="0"/>
+                <w:i w:val="0"/>
+                <w:color w:val="000000"/>
+                <w:sz w:val="20"/>
+              </w:rPr>
+              <w:t>6. Cumple con el formato del informe de avance.</w:t>
+            </w:r>
+          </w:p>
+        </w:tc>
+        <w:tc>
+          <w:tcPr>
+            <w:tcW w:type="dxa" w:w="1531"/>
+            <w:shd w:val="clear" w:color="auto" w:fill="F2F2F2"/>
+          </w:tcPr>
+          <w:p>
+            <w:r>
+              <w:rPr>
+                <w:rFonts w:ascii="Calibri" w:hAnsi="Calibri" w:cs="Calibri" w:eastAsia="Calibri"/>
+                <w:b w:val="0"/>
+                <w:i w:val="0"/>
+                <w:color w:val="000000"/>
+                <w:sz w:val="20"/>
+              </w:rPr>
+              <w:t>Logrado</w:t>
+            </w:r>
+          </w:p>
+        </w:tc>
+        <w:tc>
+          <w:tcPr>
+            <w:tcW w:type="dxa" w:w="1417"/>
+            <w:shd w:val="clear" w:color="auto" w:fill="F2F2F2"/>
+          </w:tcPr>
+          <w:p>
+            <w:r>
+              <w:rPr>
+                <w:rFonts w:ascii="Calibri" w:hAnsi="Calibri" w:cs="Calibri" w:eastAsia="Calibri"/>
+                <w:b w:val="0"/>
+                <w:i w:val="0"/>
+                <w:color w:val="000000"/>
+                <w:sz w:val="20"/>
+              </w:rPr>
+              <w:t>5</w:t>
+            </w:r>
+          </w:p>
+        </w:tc>
+        <w:tc>
+          <w:tcPr>
+            <w:tcW w:type="dxa" w:w="1020"/>
+            <w:shd w:val="clear" w:color="auto" w:fill="F2F2F2"/>
+          </w:tcPr>
+          <w:p>
+            <w:r>
+              <w:rPr>
+                <w:rFonts w:ascii="Calibri" w:hAnsi="Calibri" w:cs="Calibri" w:eastAsia="Calibri"/>
+                <w:b w:val="0"/>
+                <w:i w:val="0"/>
+                <w:color w:val="000000"/>
+                <w:sz w:val="20"/>
+              </w:rPr>
+              <w:t>3</w:t>
+            </w:r>
+          </w:p>
+        </w:tc>
+        <w:tc>
+          <w:tcPr>
+            <w:tcW w:type="dxa" w:w="6180"/>
+            <w:shd w:val="clear" w:color="auto" w:fill="F2F2F2"/>
+          </w:tcPr>
+          <w:p>
+            <w:r>
+              <w:rPr>
+                <w:rFonts w:ascii="Calibri" w:hAnsi="Calibri" w:cs="Calibri" w:eastAsia="Calibri"/>
+                <w:b w:val="0"/>
+                <w:i w:val="0"/>
+                <w:color w:val="000000"/>
+                <w:sz w:val="20"/>
+              </w:rPr>
+              <w:t>El informe tiene portada, índice, abstract en español e inglés, desarrollo, conclusiones, reflexiones, bibliografía, anexo de evidencias y número de página en Calibri 11. Falta que los cuatro integrantes completen su reflexión individual.</w:t>
+            </w:r>
+          </w:p>
+        </w:tc>
+      </w:tr>
+      <w:tr>
+        <w:tc>
+          <w:tcPr>
+            <w:tcW w:type="dxa" w:w="2835"/>
+          </w:tcPr>
+          <w:p>
+            <w:r>
+              <w:rPr>
+                <w:rFonts w:ascii="Calibri" w:hAnsi="Calibri" w:cs="Calibri" w:eastAsia="Calibri"/>
+                <w:b w:val="0"/>
+                <w:i w:val="0"/>
+                <w:color w:val="000000"/>
+                <w:sz w:val="20"/>
+              </w:rPr>
+              <w:t>7. Cumple con los indicadores de calidad disciplinarios.</w:t>
+            </w:r>
+          </w:p>
+        </w:tc>
+        <w:tc>
+          <w:tcPr>
+            <w:tcW w:type="dxa" w:w="1531"/>
+          </w:tcPr>
+          <w:p>
+            <w:r>
+              <w:rPr>
+                <w:rFonts w:ascii="Calibri" w:hAnsi="Calibri" w:cs="Calibri" w:eastAsia="Calibri"/>
+                <w:b w:val="0"/>
+                <w:i w:val="0"/>
+                <w:color w:val="000000"/>
+                <w:sz w:val="20"/>
+              </w:rPr>
+              <w:t>Logrado</w:t>
+            </w:r>
+          </w:p>
+        </w:tc>
+        <w:tc>
+          <w:tcPr>
+            <w:tcW w:type="dxa" w:w="1417"/>
+          </w:tcPr>
+          <w:p>
+            <w:r>
+              <w:rPr>
+                <w:rFonts w:ascii="Calibri" w:hAnsi="Calibri" w:cs="Calibri" w:eastAsia="Calibri"/>
+                <w:b w:val="0"/>
+                <w:i w:val="0"/>
+                <w:color w:val="000000"/>
+                <w:sz w:val="20"/>
+              </w:rPr>
+              <w:t>10</w:t>
+            </w:r>
+          </w:p>
+        </w:tc>
+        <w:tc>
+          <w:tcPr>
+            <w:tcW w:type="dxa" w:w="1020"/>
+          </w:tcPr>
+          <w:p>
+            <w:r>
+              <w:rPr>
+                <w:rFonts w:ascii="Calibri" w:hAnsi="Calibri" w:cs="Calibri" w:eastAsia="Calibri"/>
+                <w:b w:val="0"/>
+                <w:i w:val="0"/>
+                <w:color w:val="000000"/>
+                <w:sz w:val="20"/>
+              </w:rPr>
+              <w:t>6</w:t>
+            </w:r>
+          </w:p>
+        </w:tc>
+        <w:tc>
+          <w:tcPr>
+            <w:tcW w:type="dxa" w:w="6180"/>
+          </w:tcPr>
+          <w:p>
+            <w:r>
+              <w:rPr>
+                <w:rFonts w:ascii="Calibri" w:hAnsi="Calibri" w:cs="Calibri" w:eastAsia="Calibri"/>
+                <w:b w:val="0"/>
+                <w:i w:val="0"/>
+                <w:color w:val="000000"/>
+                <w:sz w:val="20"/>
+              </w:rPr>
+              <w:t>Están presentes 2.1, 2.2, 3.1 y 4.1, y parcialmente 1.2 y 3.2 (detalle en la tabla siguiente). Faltan 1.1, 1.3, 4.2 y 4.3, que corresponden a fases posteriores de la cascada. Cerca del 60 % de los indicadores.</w:t>
+            </w:r>
+          </w:p>
+        </w:tc>
+      </w:tr>
+      <w:tr>
+        <w:tc>
+          <w:tcPr>
+            <w:tcW w:type="dxa" w:w="2835"/>
+            <w:shd w:val="clear" w:color="auto" w:fill="F2F2F2"/>
+          </w:tcPr>
+          <w:p>
+            <w:r>
+              <w:rPr>
+                <w:rFonts w:ascii="Calibri" w:hAnsi="Calibri" w:cs="Calibri" w:eastAsia="Calibri"/>
+                <w:b w:val="0"/>
+                <w:i w:val="0"/>
+                <w:color w:val="000000"/>
+                <w:sz w:val="20"/>
+              </w:rPr>
+              <w:t>8. Comunica de forma escrita en inglés a un nivel intermedio alto.</w:t>
+            </w:r>
+          </w:p>
+        </w:tc>
+        <w:tc>
+          <w:tcPr>
+            <w:tcW w:type="dxa" w:w="1531"/>
+            <w:shd w:val="clear" w:color="auto" w:fill="F2F2F2"/>
+          </w:tcPr>
+          <w:p>
+            <w:r>
+              <w:rPr>
+                <w:rFonts w:ascii="Calibri" w:hAnsi="Calibri" w:cs="Calibri" w:eastAsia="Calibri"/>
+                <w:b w:val="0"/>
+                <w:i w:val="0"/>
+                <w:color w:val="000000"/>
+                <w:sz w:val="20"/>
+              </w:rPr>
+              <w:t>Logrado</w:t>
+            </w:r>
+          </w:p>
+        </w:tc>
+        <w:tc>
+          <w:tcPr>
+            <w:tcW w:type="dxa" w:w="1417"/>
+            <w:shd w:val="clear" w:color="auto" w:fill="F2F2F2"/>
+          </w:tcPr>
+          <w:p>
+            <w:r>
+              <w:rPr>
+                <w:rFonts w:ascii="Calibri" w:hAnsi="Calibri" w:cs="Calibri" w:eastAsia="Calibri"/>
+                <w:b w:val="0"/>
+                <w:i w:val="0"/>
+                <w:color w:val="000000"/>
+                <w:sz w:val="20"/>
+              </w:rPr>
+              <w:t>10</w:t>
+            </w:r>
+          </w:p>
+        </w:tc>
+        <w:tc>
+          <w:tcPr>
+            <w:tcW w:type="dxa" w:w="1020"/>
+            <w:shd w:val="clear" w:color="auto" w:fill="F2F2F2"/>
+          </w:tcPr>
+          <w:p>
+            <w:r>
+              <w:rPr>
+                <w:rFonts w:ascii="Calibri" w:hAnsi="Calibri" w:cs="Calibri" w:eastAsia="Calibri"/>
+                <w:b w:val="0"/>
+                <w:i w:val="0"/>
+                <w:color w:val="000000"/>
+                <w:sz w:val="20"/>
+              </w:rPr>
+              <w:t>6</w:t>
+            </w:r>
+          </w:p>
+        </w:tc>
+        <w:tc>
+          <w:tcPr>
+            <w:tcW w:type="dxa" w:w="6180"/>
+            <w:shd w:val="clear" w:color="auto" w:fill="F2F2F2"/>
+          </w:tcPr>
+          <w:p>
+            <w:r>
+              <w:rPr>
+                <w:rFonts w:ascii="Calibri" w:hAnsi="Calibri" w:cs="Calibri" w:eastAsia="Calibri"/>
+                <w:b w:val="0"/>
+                <w:i w:val="0"/>
+                <w:color w:val="000000"/>
+                <w:sz w:val="20"/>
+              </w:rPr>
+              <w:t>El abstract y mi conclusión y reflexión individual están redactados en inglés. Me falta una revisión de estilo; y la rúbrica evalúa a todo el equipo, así que el resultado depende de que los cuatro escriban su parte en inglés.</w:t>
+            </w:r>
+          </w:p>
+        </w:tc>
+      </w:tr>
+      <w:tr>
+        <w:tc>
+          <w:tcPr>
+            <w:tcW w:type="dxa" w:w="2835"/>
+          </w:tcPr>
+          <w:p>
+            <w:r>
+              <w:rPr>
+                <w:rFonts w:ascii="Calibri" w:hAnsi="Calibri" w:cs="Calibri" w:eastAsia="Calibri"/>
+                <w:b/>
+                <w:i w:val="0"/>
+                <w:color w:val="000000"/>
+                <w:sz w:val="20"/>
+              </w:rPr>
+              <w:t>Total</w:t>
+            </w:r>
+          </w:p>
+        </w:tc>
+        <w:tc>
+          <w:tcPr>
+            <w:tcW w:type="dxa" w:w="1531"/>
+          </w:tcPr>
+          <w:p>
+            <w:r>
+              <w:rPr>
+                <w:rFonts w:ascii="Calibri" w:hAnsi="Calibri" w:cs="Calibri" w:eastAsia="Calibri"/>
+                <w:b w:val="0"/>
+                <w:i w:val="0"/>
+                <w:color w:val="000000"/>
+                <w:sz w:val="20"/>
+              </w:rPr>
+            </w:r>
+          </w:p>
+        </w:tc>
+        <w:tc>
+          <w:tcPr>
+            <w:tcW w:type="dxa" w:w="1417"/>
+          </w:tcPr>
+          <w:p>
+            <w:r>
+              <w:rPr>
+                <w:rFonts w:ascii="Calibri" w:hAnsi="Calibri" w:cs="Calibri" w:eastAsia="Calibri"/>
+                <w:b/>
+                <w:i w:val="0"/>
+                <w:color w:val="000000"/>
+                <w:sz w:val="20"/>
+              </w:rPr>
+              <w:t>100</w:t>
+            </w:r>
+          </w:p>
+        </w:tc>
+        <w:tc>
+          <w:tcPr>
+            <w:tcW w:type="dxa" w:w="1020"/>
+          </w:tcPr>
+          <w:p>
+            <w:r>
+              <w:rPr>
+                <w:rFonts w:ascii="Calibri" w:hAnsi="Calibri" w:cs="Calibri" w:eastAsia="Calibri"/>
+                <w:b/>
+                <w:i w:val="0"/>
+                <w:color w:val="000000"/>
+                <w:sz w:val="20"/>
+              </w:rPr>
+              <w:t>70</w:t>
+            </w:r>
+          </w:p>
+        </w:tc>
+        <w:tc>
+          <w:tcPr>
+            <w:tcW w:type="dxa" w:w="6180"/>
+          </w:tcPr>
+          <w:p>
+            <w:r>
+              <w:rPr>
+                <w:rFonts w:ascii="Calibri" w:hAnsi="Calibri" w:cs="Calibri" w:eastAsia="Calibri"/>
+                <w:b w:val="0"/>
+                <w:i w:val="0"/>
+                <w:color w:val="000000"/>
+                <w:sz w:val="20"/>
+              </w:rPr>
+              <w:t>Equivale a un 70 % de logro, sobre la exigencia del 60 %, pero lejos del nivel Completamente logrado. Los indicadores 2 y 3 concentran la brecha (18 puntos).</w:t>
+            </w:r>
+          </w:p>
+        </w:tc>
+      </w:tr>
+    </w:tbl>
+    <w:p>
+      <w:pPr>
+        <w:spacing w:after="120"/>
+      </w:pPr>
+      <w:r>
+        <w:rPr>
+          <w:rFonts w:ascii="Calibri" w:hAnsi="Calibri" w:cs="Calibri" w:eastAsia="Calibri"/>
+          <w:b w:val="0"/>
+          <w:i w:val="0"/>
+          <w:color w:val="000000"/>
+          <w:sz w:val="22"/>
+        </w:rPr>
+      </w:r>
+    </w:p>
+    <w:p>
+      <w:pPr>
+        <w:spacing w:after="80"/>
+      </w:pPr>
+      <w:r>
+        <w:rPr>
+          <w:rFonts w:ascii="Calibri" w:hAnsi="Calibri" w:cs="Calibri" w:eastAsia="Calibri"/>
+          <w:b/>
+          <w:i w:val="0"/>
+          <w:color w:val="1F3864"/>
+          <w:sz w:val="26"/>
+        </w:rPr>
+        <w:t>Indicadores de calidad disciplinarios presentes en el proyecto</w:t>
+      </w:r>
+    </w:p>
+    <w:tbl>
+      <w:tblPr>
+        <w:tblW w:type="auto" w:w="0"/>
+        <w:jc w:val="center"/>
+        <w:tblBorders>
+          <w:top w:val="single" w:sz="4" w:space="0" w:color="7F7F7F"/>
+          <w:left w:val="single" w:sz="4" w:space="0" w:color="7F7F7F"/>
+          <w:bottom w:val="single" w:sz="4" w:space="0" w:color="7F7F7F"/>
+          <w:right w:val="single" w:sz="4" w:space="0" w:color="7F7F7F"/>
+          <w:insideH w:val="single" w:sz="4" w:space="0" w:color="7F7F7F"/>
+          <w:insideV w:val="single" w:sz="4" w:space="0" w:color="7F7F7F"/>
+        </w:tblBorders>
+        <w:tblLayout w:type="fixed"/>
+        <w:tblLook w:firstColumn="1" w:firstRow="1" w:lastColumn="0" w:lastRow="0" w:noHBand="0" w:noVBand="1" w:val="04A0"/>
+      </w:tblPr>
+      <w:tblGrid>
+        <w:gridCol w:w="3515"/>
+        <w:gridCol w:w="1474"/>
+        <w:gridCol w:w="7994"/>
+      </w:tblGrid>
+      <w:tr>
+        <w:trPr>
+          <w:tblHeader w:val="true"/>
+        </w:trPr>
+        <w:tc>
+          <w:tcPr>
+            <w:tcW w:type="dxa" w:w="3515"/>
+            <w:shd w:val="clear" w:color="auto" w:fill="1F3864"/>
+          </w:tcPr>
+          <w:p>
+            <w:r>
+              <w:rPr>
+                <w:rFonts w:ascii="Calibri" w:hAnsi="Calibri" w:cs="Calibri" w:eastAsia="Calibri"/>
+                <w:b/>
+                <w:i w:val="0"/>
+                <w:color w:val="FFFFFF"/>
+                <w:sz w:val="20"/>
+              </w:rPr>
+              <w:t>Indicador de calidad</w:t>
+            </w:r>
+          </w:p>
+        </w:tc>
+        <w:tc>
+          <w:tcPr>
+            <w:tcW w:type="dxa" w:w="1474"/>
+            <w:shd w:val="clear" w:color="auto" w:fill="1F3864"/>
+          </w:tcPr>
+          <w:p>
+            <w:r>
+              <w:rPr>
+                <w:rFonts w:ascii="Calibri" w:hAnsi="Calibri" w:cs="Calibri" w:eastAsia="Calibri"/>
+                <w:b/>
+                <w:i w:val="0"/>
+                <w:color w:val="FFFFFF"/>
+                <w:sz w:val="20"/>
+              </w:rPr>
+              <w:t>Estado</w:t>
+            </w:r>
+          </w:p>
+        </w:tc>
+        <w:tc>
+          <w:tcPr>
+            <w:tcW w:type="dxa" w:w="7994"/>
+            <w:shd w:val="clear" w:color="auto" w:fill="1F3864"/>
+          </w:tcPr>
+          <w:p>
+            <w:r>
+              <w:rPr>
+                <w:rFonts w:ascii="Calibri" w:hAnsi="Calibri" w:cs="Calibri" w:eastAsia="Calibri"/>
+                <w:b/>
+                <w:i w:val="0"/>
+                <w:color w:val="FFFFFF"/>
+                <w:sz w:val="20"/>
+              </w:rPr>
+              <w:t>Evidencia o motivo</w:t>
+            </w:r>
+          </w:p>
+        </w:tc>
+      </w:tr>
+      <w:tr>
+        <w:tc>
+          <w:tcPr>
+            <w:tcW w:type="dxa" w:w="3515"/>
+          </w:tcPr>
+          <w:p>
+            <w:r>
+              <w:rPr>
+                <w:rFonts w:ascii="Calibri" w:hAnsi="Calibri" w:cs="Calibri" w:eastAsia="Calibri"/>
+                <w:b w:val="0"/>
+                <w:i w:val="0"/>
+                <w:color w:val="000000"/>
+                <w:sz w:val="20"/>
+              </w:rPr>
+              <w:t>1.1 Diseña pruebas de validación</w:t>
+            </w:r>
+          </w:p>
+        </w:tc>
+        <w:tc>
+          <w:tcPr>
+            <w:tcW w:type="dxa" w:w="1474"/>
+          </w:tcPr>
+          <w:p>
+            <w:r>
+              <w:rPr>
+                <w:rFonts w:ascii="Calibri" w:hAnsi="Calibri" w:cs="Calibri" w:eastAsia="Calibri"/>
+                <w:b w:val="0"/>
+                <w:i w:val="0"/>
+                <w:color w:val="000000"/>
+                <w:sz w:val="20"/>
+              </w:rPr>
+              <w:t>No presente</w:t>
+            </w:r>
+          </w:p>
+        </w:tc>
+        <w:tc>
+          <w:tcPr>
+            <w:tcW w:type="dxa" w:w="7994"/>
+          </w:tcPr>
+          <w:p>
+            <w:r>
+              <w:rPr>
+                <w:rFonts w:ascii="Calibri" w:hAnsi="Calibri" w:cs="Calibri" w:eastAsia="Calibri"/>
+                <w:b w:val="0"/>
+                <w:i w:val="0"/>
+                <w:color w:val="000000"/>
+                <w:sz w:val="20"/>
+              </w:rPr>
+              <w:t>Los criterios de aceptación están en el SRS (mAP@0,5 ≥ 0,90, recall ≥ 0,85, latencia &lt; 5 s), pero el plan de pruebas D3 no existe.</w:t>
+            </w:r>
+          </w:p>
+        </w:tc>
+      </w:tr>
+      <w:tr>
+        <w:tc>
+          <w:tcPr>
+            <w:tcW w:type="dxa" w:w="3515"/>
+            <w:shd w:val="clear" w:color="auto" w:fill="F2F2F2"/>
+          </w:tcPr>
+          <w:p>
+            <w:r>
+              <w:rPr>
+                <w:rFonts w:ascii="Calibri" w:hAnsi="Calibri" w:cs="Calibri" w:eastAsia="Calibri"/>
+                <w:b w:val="0"/>
+                <w:i w:val="0"/>
+                <w:color w:val="000000"/>
+                <w:sz w:val="20"/>
+              </w:rPr>
+              <w:t>1.2 Aplica pruebas de validación</w:t>
+            </w:r>
+          </w:p>
+        </w:tc>
+        <w:tc>
+          <w:tcPr>
+            <w:tcW w:type="dxa" w:w="1474"/>
+            <w:shd w:val="clear" w:color="auto" w:fill="F2F2F2"/>
+          </w:tcPr>
+          <w:p>
+            <w:r>
+              <w:rPr>
+                <w:rFonts w:ascii="Calibri" w:hAnsi="Calibri" w:cs="Calibri" w:eastAsia="Calibri"/>
+                <w:b w:val="0"/>
+                <w:i w:val="0"/>
+                <w:color w:val="000000"/>
+                <w:sz w:val="20"/>
+              </w:rPr>
+              <w:t>Parcial</w:t>
+            </w:r>
+          </w:p>
+        </w:tc>
+        <w:tc>
+          <w:tcPr>
+            <w:tcW w:type="dxa" w:w="7994"/>
+            <w:shd w:val="clear" w:color="auto" w:fill="F2F2F2"/>
+          </w:tcPr>
+          <w:p>
+            <w:r>
+              <w:rPr>
+                <w:rFonts w:ascii="Calibri" w:hAnsi="Calibri" w:cs="Calibri" w:eastAsia="Calibri"/>
+                <w:b w:val="0"/>
+                <w:i w:val="0"/>
+                <w:color w:val="000000"/>
+                <w:sz w:val="20"/>
+              </w:rPr>
+              <w:t>Prueba automatizada de GET /health (pytest) en main; diez pruebas de POST /incidents en integración; validación del modelo sobre 143 imágenes de validación.</w:t>
+            </w:r>
+          </w:p>
+        </w:tc>
+      </w:tr>
+      <w:tr>
+        <w:tc>
+          <w:tcPr>
+            <w:tcW w:type="dxa" w:w="3515"/>
+          </w:tcPr>
+          <w:p>
+            <w:r>
+              <w:rPr>
+                <w:rFonts w:ascii="Calibri" w:hAnsi="Calibri" w:cs="Calibri" w:eastAsia="Calibri"/>
+                <w:b w:val="0"/>
+                <w:i w:val="0"/>
+                <w:color w:val="000000"/>
+                <w:sz w:val="20"/>
+              </w:rPr>
+              <w:t>1.3 Desarrolla mejoras en base al resultado</w:t>
+            </w:r>
+          </w:p>
+        </w:tc>
+        <w:tc>
+          <w:tcPr>
+            <w:tcW w:type="dxa" w:w="1474"/>
+          </w:tcPr>
+          <w:p>
+            <w:r>
+              <w:rPr>
+                <w:rFonts w:ascii="Calibri" w:hAnsi="Calibri" w:cs="Calibri" w:eastAsia="Calibri"/>
+                <w:b w:val="0"/>
+                <w:i w:val="0"/>
+                <w:color w:val="000000"/>
+                <w:sz w:val="20"/>
+              </w:rPr>
+              <w:t>No presente</w:t>
+            </w:r>
+          </w:p>
+        </w:tc>
+        <w:tc>
+          <w:tcPr>
+            <w:tcW w:type="dxa" w:w="7994"/>
+          </w:tcPr>
+          <w:p>
+            <w:r>
+              <w:rPr>
+                <w:rFonts w:ascii="Calibri" w:hAnsi="Calibri" w:cs="Calibri" w:eastAsia="Calibri"/>
+                <w:b w:val="0"/>
+                <w:i w:val="0"/>
+                <w:color w:val="000000"/>
+                <w:sz w:val="20"/>
+              </w:rPr>
+              <w:t>Corresponde a la fase de integración y pruebas (S13–S15). Ya está identificada la primera mejora: reentrenar para subir el recall de la regla de casco (0,757).</w:t>
+            </w:r>
+          </w:p>
+        </w:tc>
+      </w:tr>
+      <w:tr>
+        <w:tc>
+          <w:tcPr>
+            <w:tcW w:type="dxa" w:w="3515"/>
+            <w:shd w:val="clear" w:color="auto" w:fill="F2F2F2"/>
+          </w:tcPr>
+          <w:p>
+            <w:r>
+              <w:rPr>
+                <w:rFonts w:ascii="Calibri" w:hAnsi="Calibri" w:cs="Calibri" w:eastAsia="Calibri"/>
+                <w:b w:val="0"/>
+                <w:i w:val="0"/>
+                <w:color w:val="000000"/>
+                <w:sz w:val="20"/>
+              </w:rPr>
+              <w:t>2.1 Planifica proyectos informáticos</w:t>
+            </w:r>
+          </w:p>
+        </w:tc>
+        <w:tc>
+          <w:tcPr>
+            <w:tcW w:type="dxa" w:w="1474"/>
+            <w:shd w:val="clear" w:color="auto" w:fill="F2F2F2"/>
+          </w:tcPr>
+          <w:p>
+            <w:r>
+              <w:rPr>
+                <w:rFonts w:ascii="Calibri" w:hAnsi="Calibri" w:cs="Calibri" w:eastAsia="Calibri"/>
+                <w:b w:val="0"/>
+                <w:i w:val="0"/>
+                <w:color w:val="000000"/>
+                <w:sz w:val="20"/>
+              </w:rPr>
+              <w:t>Presente</w:t>
+            </w:r>
+          </w:p>
+        </w:tc>
+        <w:tc>
+          <w:tcPr>
+            <w:tcW w:type="dxa" w:w="7994"/>
+            <w:shd w:val="clear" w:color="auto" w:fill="F2F2F2"/>
+          </w:tcPr>
+          <w:p>
+            <w:r>
+              <w:rPr>
+                <w:rFonts w:ascii="Calibri" w:hAnsi="Calibri" w:cs="Calibri" w:eastAsia="Calibri"/>
+                <w:b w:val="0"/>
+                <w:i w:val="0"/>
+                <w:color w:val="000000"/>
+                <w:sz w:val="20"/>
+              </w:rPr>
+              <w:t>Metodología en cascada con puertas de fase, EDT de 8 paquetes, carta Gantt de 18 semanas con responsables y matriz de riesgos.</w:t>
+            </w:r>
+          </w:p>
+        </w:tc>
+      </w:tr>
+      <w:tr>
+        <w:tc>
+          <w:tcPr>
+            <w:tcW w:type="dxa" w:w="3515"/>
+          </w:tcPr>
+          <w:p>
+            <w:r>
+              <w:rPr>
+                <w:rFonts w:ascii="Calibri" w:hAnsi="Calibri" w:cs="Calibri" w:eastAsia="Calibri"/>
+                <w:b w:val="0"/>
+                <w:i w:val="0"/>
+                <w:color w:val="000000"/>
+                <w:sz w:val="20"/>
+              </w:rPr>
+              <w:t>2.2 Controla proyectos informáticos</w:t>
+            </w:r>
+          </w:p>
+        </w:tc>
+        <w:tc>
+          <w:tcPr>
+            <w:tcW w:type="dxa" w:w="1474"/>
+          </w:tcPr>
+          <w:p>
+            <w:r>
+              <w:rPr>
+                <w:rFonts w:ascii="Calibri" w:hAnsi="Calibri" w:cs="Calibri" w:eastAsia="Calibri"/>
+                <w:b w:val="0"/>
+                <w:i w:val="0"/>
+                <w:color w:val="000000"/>
+                <w:sz w:val="20"/>
+              </w:rPr>
+              <w:t>Presente</w:t>
+            </w:r>
+          </w:p>
+        </w:tc>
+        <w:tc>
+          <w:tcPr>
+            <w:tcW w:type="dxa" w:w="7994"/>
+          </w:tcPr>
+          <w:p>
+            <w:r>
+              <w:rPr>
+                <w:rFonts w:ascii="Calibri" w:hAnsi="Calibri" w:cs="Calibri" w:eastAsia="Calibri"/>
+                <w:b w:val="0"/>
+                <w:i w:val="0"/>
+                <w:color w:val="000000"/>
+                <w:sz w:val="20"/>
+              </w:rPr>
+              <w:t>Monitoreo del plan con estado por actividad (guía 2.4), bitácora de decisiones, revisión de pull requests con rama main protegida.</w:t>
+            </w:r>
+          </w:p>
+        </w:tc>
+      </w:tr>
+      <w:tr>
+        <w:tc>
+          <w:tcPr>
+            <w:tcW w:type="dxa" w:w="3515"/>
+            <w:shd w:val="clear" w:color="auto" w:fill="F2F2F2"/>
+          </w:tcPr>
+          <w:p>
+            <w:r>
+              <w:rPr>
+                <w:rFonts w:ascii="Calibri" w:hAnsi="Calibri" w:cs="Calibri" w:eastAsia="Calibri"/>
+                <w:b w:val="0"/>
+                <w:i w:val="0"/>
+                <w:color w:val="000000"/>
+                <w:sz w:val="20"/>
+              </w:rPr>
+              <w:t>3.1 Diseña modelos de datos</w:t>
+            </w:r>
+          </w:p>
+        </w:tc>
+        <w:tc>
+          <w:tcPr>
+            <w:tcW w:type="dxa" w:w="1474"/>
+            <w:shd w:val="clear" w:color="auto" w:fill="F2F2F2"/>
+          </w:tcPr>
+          <w:p>
+            <w:r>
+              <w:rPr>
+                <w:rFonts w:ascii="Calibri" w:hAnsi="Calibri" w:cs="Calibri" w:eastAsia="Calibri"/>
+                <w:b w:val="0"/>
+                <w:i w:val="0"/>
+                <w:color w:val="000000"/>
+                <w:sz w:val="20"/>
+              </w:rPr>
+              <w:t>Presente</w:t>
+            </w:r>
+          </w:p>
+        </w:tc>
+        <w:tc>
+          <w:tcPr>
+            <w:tcW w:type="dxa" w:w="7994"/>
+            <w:shd w:val="clear" w:color="auto" w:fill="F2F2F2"/>
+          </w:tcPr>
+          <w:p>
+            <w:r>
+              <w:rPr>
+                <w:rFonts w:ascii="Calibri" w:hAnsi="Calibri" w:cs="Calibri" w:eastAsia="Calibri"/>
+                <w:b w:val="0"/>
+                <w:i w:val="0"/>
+                <w:color w:val="000000"/>
+                <w:sz w:val="20"/>
+              </w:rPr>
+              <w:t>Entidades definidas en el SRS y contrato de incidentes en docs/API.md. Falta el diagrama ER completo en el D2.</w:t>
+            </w:r>
+          </w:p>
+        </w:tc>
+      </w:tr>
+      <w:tr>
+        <w:tc>
+          <w:tcPr>
+            <w:tcW w:type="dxa" w:w="3515"/>
+          </w:tcPr>
+          <w:p>
+            <w:r>
+              <w:rPr>
+                <w:rFonts w:ascii="Calibri" w:hAnsi="Calibri" w:cs="Calibri" w:eastAsia="Calibri"/>
+                <w:b w:val="0"/>
+                <w:i w:val="0"/>
+                <w:color w:val="000000"/>
+                <w:sz w:val="20"/>
+              </w:rPr>
+              <w:t>3.2 Implementa modelos de datos</w:t>
+            </w:r>
+          </w:p>
+        </w:tc>
+        <w:tc>
+          <w:tcPr>
+            <w:tcW w:type="dxa" w:w="1474"/>
+          </w:tcPr>
+          <w:p>
+            <w:r>
+              <w:rPr>
+                <w:rFonts w:ascii="Calibri" w:hAnsi="Calibri" w:cs="Calibri" w:eastAsia="Calibri"/>
+                <w:b w:val="0"/>
+                <w:i w:val="0"/>
+                <w:color w:val="000000"/>
+                <w:sz w:val="20"/>
+              </w:rPr>
+              <w:t>Parcial</w:t>
+            </w:r>
+          </w:p>
+        </w:tc>
+        <w:tc>
+          <w:tcPr>
+            <w:tcW w:type="dxa" w:w="7994"/>
+          </w:tcPr>
+          <w:p>
+            <w:r>
+              <w:rPr>
+                <w:rFonts w:ascii="Calibri" w:hAnsi="Calibri" w:cs="Calibri" w:eastAsia="Calibri"/>
+                <w:b w:val="0"/>
+                <w:i w:val="0"/>
+                <w:color w:val="000000"/>
+                <w:sz w:val="20"/>
+              </w:rPr>
+              <w:t>Migración 001_create_incidents.sql en PostgreSQL (rama de Fernando, en integración). Faltan las tablas de cámaras, zonas, usuarios y roles.</w:t>
+            </w:r>
+          </w:p>
+        </w:tc>
+      </w:tr>
+      <w:tr>
+        <w:tc>
+          <w:tcPr>
+            <w:tcW w:type="dxa" w:w="3515"/>
+            <w:shd w:val="clear" w:color="auto" w:fill="F2F2F2"/>
+          </w:tcPr>
+          <w:p>
+            <w:r>
+              <w:rPr>
+                <w:rFonts w:ascii="Calibri" w:hAnsi="Calibri" w:cs="Calibri" w:eastAsia="Calibri"/>
+                <w:b w:val="0"/>
+                <w:i w:val="0"/>
+                <w:color w:val="000000"/>
+                <w:sz w:val="20"/>
+              </w:rPr>
+              <w:t>4.1 Construye una solución de software</w:t>
+            </w:r>
+          </w:p>
+        </w:tc>
+        <w:tc>
+          <w:tcPr>
+            <w:tcW w:type="dxa" w:w="1474"/>
+            <w:shd w:val="clear" w:color="auto" w:fill="F2F2F2"/>
+          </w:tcPr>
+          <w:p>
+            <w:r>
+              <w:rPr>
+                <w:rFonts w:ascii="Calibri" w:hAnsi="Calibri" w:cs="Calibri" w:eastAsia="Calibri"/>
+                <w:b w:val="0"/>
+                <w:i w:val="0"/>
+                <w:color w:val="000000"/>
+                <w:sz w:val="20"/>
+              </w:rPr>
+              <w:t>Presente</w:t>
+            </w:r>
+          </w:p>
+        </w:tc>
+        <w:tc>
+          <w:tcPr>
+            <w:tcW w:type="dxa" w:w="7994"/>
+            <w:shd w:val="clear" w:color="auto" w:fill="F2F2F2"/>
+          </w:tcPr>
+          <w:p>
+            <w:r>
+              <w:rPr>
+                <w:rFonts w:ascii="Calibri" w:hAnsi="Calibri" w:cs="Calibri" w:eastAsia="Calibri"/>
+                <w:b w:val="0"/>
+                <w:i w:val="0"/>
+                <w:color w:val="000000"/>
+                <w:sz w:val="20"/>
+              </w:rPr>
+              <w:t>API FastAPI, motor de detección YOLO26 con reglas de casco y chaleco y difuminado facial, agente de monitoreo que envía incidentes a la API.</w:t>
+            </w:r>
+          </w:p>
+        </w:tc>
+      </w:tr>
+      <w:tr>
+        <w:tc>
+          <w:tcPr>
+            <w:tcW w:type="dxa" w:w="3515"/>
+          </w:tcPr>
+          <w:p>
+            <w:r>
+              <w:rPr>
+                <w:rFonts w:ascii="Calibri" w:hAnsi="Calibri" w:cs="Calibri" w:eastAsia="Calibri"/>
+                <w:b w:val="0"/>
+                <w:i w:val="0"/>
+                <w:color w:val="000000"/>
+                <w:sz w:val="20"/>
+              </w:rPr>
+              <w:t>4.2 Integra los componentes</w:t>
+            </w:r>
+          </w:p>
+        </w:tc>
+        <w:tc>
+          <w:tcPr>
+            <w:tcW w:type="dxa" w:w="1474"/>
+          </w:tcPr>
+          <w:p>
+            <w:r>
+              <w:rPr>
+                <w:rFonts w:ascii="Calibri" w:hAnsi="Calibri" w:cs="Calibri" w:eastAsia="Calibri"/>
+                <w:b w:val="0"/>
+                <w:i w:val="0"/>
+                <w:color w:val="000000"/>
+                <w:sz w:val="20"/>
+              </w:rPr>
+              <w:t>No presente</w:t>
+            </w:r>
+          </w:p>
+        </w:tc>
+        <w:tc>
+          <w:tcPr>
+            <w:tcW w:type="dxa" w:w="7994"/>
+          </w:tcPr>
+          <w:p>
+            <w:r>
+              <w:rPr>
+                <w:rFonts w:ascii="Calibri" w:hAnsi="Calibri" w:cs="Calibri" w:eastAsia="Calibri"/>
+                <w:b w:val="0"/>
+                <w:i w:val="0"/>
+                <w:color w:val="000000"/>
+                <w:sz w:val="20"/>
+              </w:rPr>
+              <w:t>La integración (S13) aún no empieza. La primera integración real (motor → API → base de datos) está en curso.</w:t>
+            </w:r>
+          </w:p>
+        </w:tc>
+      </w:tr>
+      <w:tr>
+        <w:tc>
+          <w:tcPr>
+            <w:tcW w:type="dxa" w:w="3515"/>
+            <w:shd w:val="clear" w:color="auto" w:fill="F2F2F2"/>
+          </w:tcPr>
+          <w:p>
+            <w:r>
+              <w:rPr>
+                <w:rFonts w:ascii="Calibri" w:hAnsi="Calibri" w:cs="Calibri" w:eastAsia="Calibri"/>
+                <w:b w:val="0"/>
+                <w:i w:val="0"/>
+                <w:color w:val="000000"/>
+                <w:sz w:val="20"/>
+              </w:rPr>
+              <w:t>4.3 Implanta la solución</w:t>
+            </w:r>
+          </w:p>
+        </w:tc>
+        <w:tc>
+          <w:tcPr>
+            <w:tcW w:type="dxa" w:w="1474"/>
+            <w:shd w:val="clear" w:color="auto" w:fill="F2F2F2"/>
+          </w:tcPr>
+          <w:p>
+            <w:r>
+              <w:rPr>
+                <w:rFonts w:ascii="Calibri" w:hAnsi="Calibri" w:cs="Calibri" w:eastAsia="Calibri"/>
+                <w:b w:val="0"/>
+                <w:i w:val="0"/>
+                <w:color w:val="000000"/>
+                <w:sz w:val="20"/>
+              </w:rPr>
+              <w:t>No presente</w:t>
+            </w:r>
+          </w:p>
+        </w:tc>
+        <w:tc>
+          <w:tcPr>
+            <w:tcW w:type="dxa" w:w="7994"/>
+            <w:shd w:val="clear" w:color="auto" w:fill="F2F2F2"/>
+          </w:tcPr>
+          <w:p>
+            <w:r>
+              <w:rPr>
+                <w:rFonts w:ascii="Calibri" w:hAnsi="Calibri" w:cs="Calibri" w:eastAsia="Calibri"/>
+                <w:b w:val="0"/>
+                <w:i w:val="0"/>
+                <w:color w:val="000000"/>
+                <w:sz w:val="20"/>
+              </w:rPr>
+              <w:t>Despliegue con Docker Compose planificado para S15; los contenedores no se han iniciado.</w:t>
+            </w:r>
+          </w:p>
+        </w:tc>
+      </w:tr>
+    </w:tbl>
+    <w:p>
+      <w:pPr>
+        <w:spacing w:after="120"/>
+      </w:pPr>
+      <w:r>
+        <w:rPr>
+          <w:rFonts w:ascii="Calibri" w:hAnsi="Calibri" w:cs="Calibri" w:eastAsia="Calibri"/>
+          <w:b w:val="0"/>
+          <w:i w:val="0"/>
+          <w:color w:val="000000"/>
+          <w:sz w:val="22"/>
+        </w:rPr>
+      </w:r>
+    </w:p>
+    <w:p>
+      <w:pPr>
+        <w:spacing w:after="80"/>
+      </w:pPr>
+      <w:r>
+        <w:rPr>
+          <w:rFonts w:ascii="Calibri" w:hAnsi="Calibri" w:cs="Calibri" w:eastAsia="Calibri"/>
+          <w:b/>
+          <w:i w:val="0"/>
+          <w:color w:val="1F3864"/>
+          <w:sz w:val="26"/>
+        </w:rPr>
+        <w:t>Ajustes por realizar antes de la evaluación sumativa</w:t>
+      </w:r>
+    </w:p>
+    <w:tbl>
+      <w:tblPr>
+        <w:tblW w:type="auto" w:w="0"/>
+        <w:jc w:val="center"/>
+        <w:tblBorders>
+          <w:top w:val="single" w:sz="4" w:space="0" w:color="7F7F7F"/>
+          <w:left w:val="single" w:sz="4" w:space="0" w:color="7F7F7F"/>
+          <w:bottom w:val="single" w:sz="4" w:space="0" w:color="7F7F7F"/>
+          <w:right w:val="single" w:sz="4" w:space="0" w:color="7F7F7F"/>
+          <w:insideH w:val="single" w:sz="4" w:space="0" w:color="7F7F7F"/>
+          <w:insideV w:val="single" w:sz="4" w:space="0" w:color="7F7F7F"/>
+        </w:tblBorders>
+        <w:tblLayout w:type="fixed"/>
+        <w:tblLook w:firstColumn="1" w:firstRow="1" w:lastColumn="0" w:lastRow="0" w:noHBand="0" w:noVBand="1" w:val="04A0"/>
+      </w:tblPr>
+      <w:tblGrid>
+        <w:gridCol w:w="2608"/>
+        <w:gridCol w:w="2041"/>
+        <w:gridCol w:w="5443"/>
+        <w:gridCol w:w="2891"/>
+      </w:tblGrid>
+      <w:tr>
+        <w:trPr>
+          <w:tblHeader w:val="true"/>
+        </w:trPr>
+        <w:tc>
+          <w:tcPr>
+            <w:tcW w:type="dxa" w:w="2608"/>
+            <w:shd w:val="clear" w:color="auto" w:fill="1F3864"/>
+          </w:tcPr>
+          <w:p>
+            <w:r>
+              <w:rPr>
+                <w:rFonts w:ascii="Calibri" w:hAnsi="Calibri" w:cs="Calibri" w:eastAsia="Calibri"/>
+                <w:b/>
+                <w:i w:val="0"/>
+                <w:color w:val="FFFFFF"/>
+                <w:sz w:val="20"/>
+              </w:rPr>
+              <w:t>Ajuste</w:t>
+            </w:r>
+          </w:p>
+        </w:tc>
+        <w:tc>
+          <w:tcPr>
+            <w:tcW w:type="dxa" w:w="2041"/>
+            <w:shd w:val="clear" w:color="auto" w:fill="1F3864"/>
+          </w:tcPr>
+          <w:p>
+            <w:r>
+              <w:rPr>
+                <w:rFonts w:ascii="Calibri" w:hAnsi="Calibri" w:cs="Calibri" w:eastAsia="Calibri"/>
+                <w:b/>
+                <w:i w:val="0"/>
+                <w:color w:val="FFFFFF"/>
+                <w:sz w:val="20"/>
+              </w:rPr>
+              <w:t>Indicador que impacta</w:t>
+            </w:r>
+          </w:p>
+        </w:tc>
+        <w:tc>
+          <w:tcPr>
+            <w:tcW w:type="dxa" w:w="5443"/>
+            <w:shd w:val="clear" w:color="auto" w:fill="1F3864"/>
+          </w:tcPr>
+          <w:p>
+            <w:r>
+              <w:rPr>
+                <w:rFonts w:ascii="Calibri" w:hAnsi="Calibri" w:cs="Calibri" w:eastAsia="Calibri"/>
+                <w:b/>
+                <w:i w:val="0"/>
+                <w:color w:val="FFFFFF"/>
+                <w:sz w:val="20"/>
+              </w:rPr>
+              <w:t>Acción</w:t>
+            </w:r>
+          </w:p>
+        </w:tc>
+        <w:tc>
+          <w:tcPr>
+            <w:tcW w:type="dxa" w:w="2891"/>
+            <w:shd w:val="clear" w:color="auto" w:fill="1F3864"/>
+          </w:tcPr>
+          <w:p>
+            <w:r>
+              <w:rPr>
+                <w:rFonts w:ascii="Calibri" w:hAnsi="Calibri" w:cs="Calibri" w:eastAsia="Calibri"/>
+                <w:b/>
+                <w:i w:val="0"/>
+                <w:color w:val="FFFFFF"/>
+                <w:sz w:val="20"/>
+              </w:rPr>
+              <w:t>Responsable y plazo</w:t>
+            </w:r>
+          </w:p>
+        </w:tc>
+      </w:tr>
+      <w:tr>
+        <w:tc>
+          <w:tcPr>
+            <w:tcW w:type="dxa" w:w="2608"/>
+          </w:tcPr>
+          <w:p>
+            <w:r>
+              <w:rPr>
+                <w:rFonts w:ascii="Calibri" w:hAnsi="Calibri" w:cs="Calibri" w:eastAsia="Calibri"/>
+                <w:b w:val="0"/>
+                <w:i w:val="0"/>
+                <w:color w:val="000000"/>
+                <w:sz w:val="20"/>
+              </w:rPr>
+              <w:t>Cerrar las puertas de fase pendientes</w:t>
+            </w:r>
+          </w:p>
+        </w:tc>
+        <w:tc>
+          <w:tcPr>
+            <w:tcW w:type="dxa" w:w="2041"/>
+          </w:tcPr>
+          <w:p>
+            <w:r>
+              <w:rPr>
+                <w:rFonts w:ascii="Calibri" w:hAnsi="Calibri" w:cs="Calibri" w:eastAsia="Calibri"/>
+                <w:b w:val="0"/>
+                <w:i w:val="0"/>
+                <w:color w:val="000000"/>
+                <w:sz w:val="20"/>
+              </w:rPr>
+              <w:t>Indicador 2</w:t>
+            </w:r>
+          </w:p>
+        </w:tc>
+        <w:tc>
+          <w:tcPr>
+            <w:tcW w:type="dxa" w:w="5443"/>
+          </w:tcPr>
+          <w:p>
+            <w:r>
+              <w:rPr>
+                <w:rFonts w:ascii="Calibri" w:hAnsi="Calibri" w:cs="Calibri" w:eastAsia="Calibri"/>
+                <w:b w:val="0"/>
+                <w:i w:val="0"/>
+                <w:color w:val="000000"/>
+                <w:sz w:val="20"/>
+              </w:rPr>
+              <w:t>Aprobar el SRS v1.0 (resolviendo la sección 4.6 y sacando la vibración, descartada el 23-09) y consolidar el D2 con arquitectura, ER, UML, protocolo de alerta y diseño Docker.</w:t>
+            </w:r>
+          </w:p>
+        </w:tc>
+        <w:tc>
+          <w:tcPr>
+            <w:tcW w:type="dxa" w:w="2891"/>
+          </w:tcPr>
+          <w:p>
+            <w:r>
+              <w:rPr>
+                <w:rFonts w:ascii="Calibri" w:hAnsi="Calibri" w:cs="Calibri" w:eastAsia="Calibri"/>
+                <w:b w:val="0"/>
+                <w:i w:val="0"/>
+                <w:color w:val="000000"/>
+                <w:sz w:val="20"/>
+              </w:rPr>
+              <w:t>Iahn Vera (consolida) · semana 11</w:t>
+            </w:r>
+          </w:p>
+        </w:tc>
+      </w:tr>
+      <w:tr>
+        <w:tc>
+          <w:tcPr>
+            <w:tcW w:type="dxa" w:w="2608"/>
+            <w:shd w:val="clear" w:color="auto" w:fill="F2F2F2"/>
+          </w:tcPr>
+          <w:p>
+            <w:r>
+              <w:rPr>
+                <w:rFonts w:ascii="Calibri" w:hAnsi="Calibri" w:cs="Calibri" w:eastAsia="Calibri"/>
+                <w:b w:val="0"/>
+                <w:i w:val="0"/>
+                <w:color w:val="000000"/>
+                <w:sz w:val="20"/>
+              </w:rPr>
+              <w:t>Integrar la persistencia de incidentes</w:t>
+            </w:r>
+          </w:p>
+        </w:tc>
+        <w:tc>
+          <w:tcPr>
+            <w:tcW w:type="dxa" w:w="2041"/>
+            <w:shd w:val="clear" w:color="auto" w:fill="F2F2F2"/>
+          </w:tcPr>
+          <w:p>
+            <w:r>
+              <w:rPr>
+                <w:rFonts w:ascii="Calibri" w:hAnsi="Calibri" w:cs="Calibri" w:eastAsia="Calibri"/>
+                <w:b w:val="0"/>
+                <w:i w:val="0"/>
+                <w:color w:val="000000"/>
+                <w:sz w:val="20"/>
+              </w:rPr>
+              <w:t>Indicadores 3 y 7</w:t>
+            </w:r>
+          </w:p>
+        </w:tc>
+        <w:tc>
+          <w:tcPr>
+            <w:tcW w:type="dxa" w:w="5443"/>
+            <w:shd w:val="clear" w:color="auto" w:fill="F2F2F2"/>
+          </w:tcPr>
+          <w:p>
+            <w:r>
+              <w:rPr>
+                <w:rFonts w:ascii="Calibri" w:hAnsi="Calibri" w:cs="Calibri" w:eastAsia="Calibri"/>
+                <w:b w:val="0"/>
+                <w:i w:val="0"/>
+                <w:color w:val="000000"/>
+                <w:sz w:val="20"/>
+              </w:rPr>
+              <w:t>Unir en una sola rama POST /incidents con PostgreSQL, token del agente Edge y las diez pruebas; entrar a main por pull request revisado.</w:t>
+            </w:r>
+          </w:p>
+        </w:tc>
+        <w:tc>
+          <w:tcPr>
+            <w:tcW w:type="dxa" w:w="2891"/>
+            <w:shd w:val="clear" w:color="auto" w:fill="F2F2F2"/>
+          </w:tcPr>
+          <w:p>
+            <w:r>
+              <w:rPr>
+                <w:rFonts w:ascii="Calibri" w:hAnsi="Calibri" w:cs="Calibri" w:eastAsia="Calibri"/>
+                <w:b w:val="0"/>
+                <w:i w:val="0"/>
+                <w:color w:val="000000"/>
+                <w:sz w:val="20"/>
+              </w:rPr>
+              <w:t>Iahn Vera y Fernando Muñoz · semana 10–11</w:t>
+            </w:r>
+          </w:p>
+        </w:tc>
+      </w:tr>
+      <w:tr>
+        <w:tc>
+          <w:tcPr>
+            <w:tcW w:type="dxa" w:w="2608"/>
+          </w:tcPr>
+          <w:p>
+            <w:r>
+              <w:rPr>
+                <w:rFonts w:ascii="Calibri" w:hAnsi="Calibri" w:cs="Calibri" w:eastAsia="Calibri"/>
+                <w:b w:val="0"/>
+                <w:i w:val="0"/>
+                <w:color w:val="000000"/>
+                <w:sz w:val="20"/>
+              </w:rPr>
+              <w:t>Ordenar el repositorio</w:t>
+            </w:r>
+          </w:p>
+        </w:tc>
+        <w:tc>
+          <w:tcPr>
+            <w:tcW w:type="dxa" w:w="2041"/>
+          </w:tcPr>
+          <w:p>
+            <w:r>
+              <w:rPr>
+                <w:rFonts w:ascii="Calibri" w:hAnsi="Calibri" w:cs="Calibri" w:eastAsia="Calibri"/>
+                <w:b w:val="0"/>
+                <w:i w:val="0"/>
+                <w:color w:val="000000"/>
+                <w:sz w:val="20"/>
+              </w:rPr>
+              <w:t>Indicador 3 (estructura, criterio 6 de la sumativa)</w:t>
+            </w:r>
+          </w:p>
+        </w:tc>
+        <w:tc>
+          <w:tcPr>
+            <w:tcW w:type="dxa" w:w="5443"/>
+          </w:tcPr>
+          <w:p>
+            <w:r>
+              <w:rPr>
+                <w:rFonts w:ascii="Calibri" w:hAnsi="Calibri" w:cs="Calibri" w:eastAsia="Calibri"/>
+                <w:b w:val="0"/>
+                <w:i w:val="0"/>
+                <w:color w:val="000000"/>
+                <w:sz w:val="20"/>
+              </w:rPr>
+              <w:t>Sacar el dataset y los pesos duplicados de la raíz, dejar el modelo en models/ con sus métricas y mover README2.md a la carpeta del modelo.</w:t>
+            </w:r>
+          </w:p>
+        </w:tc>
+        <w:tc>
+          <w:tcPr>
+            <w:tcW w:type="dxa" w:w="2891"/>
+          </w:tcPr>
+          <w:p>
+            <w:r>
+              <w:rPr>
+                <w:rFonts w:ascii="Calibri" w:hAnsi="Calibri" w:cs="Calibri" w:eastAsia="Calibri"/>
+                <w:b w:val="0"/>
+                <w:i w:val="0"/>
+                <w:color w:val="000000"/>
+                <w:sz w:val="20"/>
+              </w:rPr>
+              <w:t>Joaquín Armijo · semana 11</w:t>
+            </w:r>
+          </w:p>
+        </w:tc>
+      </w:tr>
+      <w:tr>
+        <w:tc>
+          <w:tcPr>
+            <w:tcW w:type="dxa" w:w="2608"/>
+            <w:shd w:val="clear" w:color="auto" w:fill="F2F2F2"/>
+          </w:tcPr>
+          <w:p>
+            <w:r>
+              <w:rPr>
+                <w:rFonts w:ascii="Calibri" w:hAnsi="Calibri" w:cs="Calibri" w:eastAsia="Calibri"/>
+                <w:b w:val="0"/>
+                <w:i w:val="0"/>
+                <w:color w:val="000000"/>
+                <w:sz w:val="20"/>
+              </w:rPr>
+              <w:t>Subir el recall de la regla de casco</w:t>
+            </w:r>
+          </w:p>
+        </w:tc>
+        <w:tc>
+          <w:tcPr>
+            <w:tcW w:type="dxa" w:w="2041"/>
+            <w:shd w:val="clear" w:color="auto" w:fill="F2F2F2"/>
+          </w:tcPr>
+          <w:p>
+            <w:r>
+              <w:rPr>
+                <w:rFonts w:ascii="Calibri" w:hAnsi="Calibri" w:cs="Calibri" w:eastAsia="Calibri"/>
+                <w:b w:val="0"/>
+                <w:i w:val="0"/>
+                <w:color w:val="000000"/>
+                <w:sz w:val="20"/>
+              </w:rPr>
+              <w:t>Indicadores 3 y 7 (1.3)</w:t>
+            </w:r>
+          </w:p>
+        </w:tc>
+        <w:tc>
+          <w:tcPr>
+            <w:tcW w:type="dxa" w:w="5443"/>
+            <w:shd w:val="clear" w:color="auto" w:fill="F2F2F2"/>
+          </w:tcPr>
+          <w:p>
+            <w:r>
+              <w:rPr>
+                <w:rFonts w:ascii="Calibri" w:hAnsi="Calibri" w:cs="Calibri" w:eastAsia="Calibri"/>
+                <w:b w:val="0"/>
+                <w:i w:val="0"/>
+                <w:color w:val="000000"/>
+                <w:sz w:val="20"/>
+              </w:rPr>
+              <w:t>Reentrenar priorizando helmet y no_helmet, sumar imágenes propias y exportar a ONNX para el agente Edge.</w:t>
+            </w:r>
+          </w:p>
+        </w:tc>
+        <w:tc>
+          <w:tcPr>
+            <w:tcW w:type="dxa" w:w="2891"/>
+            <w:shd w:val="clear" w:color="auto" w:fill="F2F2F2"/>
+          </w:tcPr>
+          <w:p>
+            <w:r>
+              <w:rPr>
+                <w:rFonts w:ascii="Calibri" w:hAnsi="Calibri" w:cs="Calibri" w:eastAsia="Calibri"/>
+                <w:b w:val="0"/>
+                <w:i w:val="0"/>
+                <w:color w:val="000000"/>
+                <w:sz w:val="20"/>
+              </w:rPr>
+              <w:t>Joaquín Armijo e Iahn Vera · semanas 11–12</w:t>
+            </w:r>
+          </w:p>
+        </w:tc>
+      </w:tr>
+      <w:tr>
+        <w:tc>
+          <w:tcPr>
+            <w:tcW w:type="dxa" w:w="2608"/>
+          </w:tcPr>
+          <w:p>
+            <w:r>
+              <w:rPr>
+                <w:rFonts w:ascii="Calibri" w:hAnsi="Calibri" w:cs="Calibri" w:eastAsia="Calibri"/>
+                <w:b w:val="0"/>
+                <w:i w:val="0"/>
+                <w:color w:val="000000"/>
+                <w:sz w:val="20"/>
+              </w:rPr>
+              <w:t>Plan de pruebas D3</w:t>
+            </w:r>
+          </w:p>
+        </w:tc>
+        <w:tc>
+          <w:tcPr>
+            <w:tcW w:type="dxa" w:w="2041"/>
+          </w:tcPr>
+          <w:p>
+            <w:r>
+              <w:rPr>
+                <w:rFonts w:ascii="Calibri" w:hAnsi="Calibri" w:cs="Calibri" w:eastAsia="Calibri"/>
+                <w:b w:val="0"/>
+                <w:i w:val="0"/>
+                <w:color w:val="000000"/>
+                <w:sz w:val="20"/>
+              </w:rPr>
+              <w:t>Indicador 7 (1.1)</w:t>
+            </w:r>
+          </w:p>
+        </w:tc>
+        <w:tc>
+          <w:tcPr>
+            <w:tcW w:type="dxa" w:w="5443"/>
+          </w:tcPr>
+          <w:p>
+            <w:r>
+              <w:rPr>
+                <w:rFonts w:ascii="Calibri" w:hAnsi="Calibri" w:cs="Calibri" w:eastAsia="Calibri"/>
+                <w:b w:val="0"/>
+                <w:i w:val="0"/>
+                <w:color w:val="000000"/>
+                <w:sz w:val="20"/>
+              </w:rPr>
+              <w:t>Documentar los casos de prueba unitarios, de integración, de rendimiento y de seguridad con sus criterios de aceptación.</w:t>
+            </w:r>
+          </w:p>
+        </w:tc>
+        <w:tc>
+          <w:tcPr>
+            <w:tcW w:type="dxa" w:w="2891"/>
+          </w:tcPr>
+          <w:p>
+            <w:r>
+              <w:rPr>
+                <w:rFonts w:ascii="Calibri" w:hAnsi="Calibri" w:cs="Calibri" w:eastAsia="Calibri"/>
+                <w:b w:val="0"/>
+                <w:i w:val="0"/>
+                <w:color w:val="000000"/>
+                <w:sz w:val="20"/>
+              </w:rPr>
+              <w:t>Fernando Muñoz · semana 11</w:t>
+            </w:r>
+          </w:p>
+        </w:tc>
+      </w:tr>
+      <w:tr>
+        <w:tc>
+          <w:tcPr>
+            <w:tcW w:type="dxa" w:w="2608"/>
+            <w:shd w:val="clear" w:color="auto" w:fill="F2F2F2"/>
+          </w:tcPr>
+          <w:p>
+            <w:r>
+              <w:rPr>
+                <w:rFonts w:ascii="Calibri" w:hAnsi="Calibri" w:cs="Calibri" w:eastAsia="Calibri"/>
+                <w:b w:val="0"/>
+                <w:i w:val="0"/>
+                <w:color w:val="000000"/>
+                <w:sz w:val="20"/>
+              </w:rPr>
+              <w:t>Equilibrar el aporte en Git</w:t>
+            </w:r>
+          </w:p>
+        </w:tc>
+        <w:tc>
+          <w:tcPr>
+            <w:tcW w:type="dxa" w:w="2041"/>
+            <w:shd w:val="clear" w:color="auto" w:fill="F2F2F2"/>
+          </w:tcPr>
+          <w:p>
+            <w:r>
+              <w:rPr>
+                <w:rFonts w:ascii="Calibri" w:hAnsi="Calibri" w:cs="Calibri" w:eastAsia="Calibri"/>
+                <w:b w:val="0"/>
+                <w:i w:val="0"/>
+                <w:color w:val="000000"/>
+                <w:sz w:val="20"/>
+              </w:rPr>
+              <w:t>Criterio 7 de la sumativa (15 pts)</w:t>
+            </w:r>
+          </w:p>
+        </w:tc>
+        <w:tc>
+          <w:tcPr>
+            <w:tcW w:type="dxa" w:w="5443"/>
+            <w:shd w:val="clear" w:color="auto" w:fill="F2F2F2"/>
+          </w:tcPr>
+          <w:p>
+            <w:r>
+              <w:rPr>
+                <w:rFonts w:ascii="Calibri" w:hAnsi="Calibri" w:cs="Calibri" w:eastAsia="Calibri"/>
+                <w:b w:val="0"/>
+                <w:i w:val="0"/>
+                <w:color w:val="000000"/>
+                <w:sz w:val="20"/>
+              </w:rPr>
+              <w:t>Cada integrante sube su trabajo desde su cuenta, con una rama por tarea y mensajes de commit descriptivos. En mi caso: agente Edge con RTSP y receptor simulado.</w:t>
+            </w:r>
+          </w:p>
+        </w:tc>
+        <w:tc>
+          <w:tcPr>
+            <w:tcW w:type="dxa" w:w="2891"/>
+            <w:shd w:val="clear" w:color="auto" w:fill="F2F2F2"/>
+          </w:tcPr>
+          <w:p>
+            <w:r>
+              <w:rPr>
+                <w:rFonts w:ascii="Calibri" w:hAnsi="Calibri" w:cs="Calibri" w:eastAsia="Calibri"/>
+                <w:b w:val="0"/>
+                <w:i w:val="0"/>
+                <w:color w:val="000000"/>
+                <w:sz w:val="20"/>
+              </w:rPr>
+              <w:t>Equipo · continuo</w:t>
+            </w:r>
+          </w:p>
+        </w:tc>
+      </w:tr>
+    </w:tbl>
+    <w:p>
+      <w:pPr>
+        <w:spacing w:after="120"/>
+      </w:pPr>
+      <w:r>
+        <w:rPr>
+          <w:rFonts w:ascii="Calibri" w:hAnsi="Calibri" w:cs="Calibri" w:eastAsia="Calibri"/>
+          <w:b w:val="0"/>
+          <w:i w:val="0"/>
+          <w:color w:val="000000"/>
+          <w:sz w:val="22"/>
+        </w:rPr>
+      </w:r>
+    </w:p>
+    <w:p>
+      <w:pPr>
+        <w:spacing w:after="80"/>
+      </w:pPr>
+      <w:r>
+        <w:rPr>
+          <w:rFonts w:ascii="Calibri" w:hAnsi="Calibri" w:cs="Calibri" w:eastAsia="Calibri"/>
+          <w:b/>
+          <w:i w:val="0"/>
+          <w:color w:val="1F3864"/>
+          <w:sz w:val="26"/>
+        </w:rPr>
+        <w:t>Fortalezas y aspectos por mejorar detectados</w:t>
+      </w:r>
+    </w:p>
+    <w:p>
+      <w:pPr>
+        <w:spacing w:after="120"/>
+      </w:pPr>
+      <w:r>
+        <w:rPr>
+          <w:rFonts w:ascii="Calibri" w:hAnsi="Calibri" w:cs="Calibri" w:eastAsia="Calibri"/>
+          <w:b/>
+          <w:i w:val="0"/>
+          <w:color w:val="000000"/>
+          <w:sz w:val="22"/>
+        </w:rPr>
+        <w:t xml:space="preserve">Fortaleza principal. </w:t>
+      </w:r>
+      <w:r>
+        <w:rPr>
+          <w:rFonts w:ascii="Calibri" w:hAnsi="Calibri" w:cs="Calibri" w:eastAsia="Calibri"/>
+          <w:b w:val="0"/>
+          <w:i w:val="0"/>
+          <w:color w:val="000000"/>
+          <w:sz w:val="22"/>
+        </w:rPr>
+        <w:t>El proyecto se gestiona como tal: cada cambio de rumbo (metodología, tipo de alerta, emisor de la alerta, modelo YOLO26) quedó registrado con su motivo, y el monitoreo del plan dice con honestidad qué está atrasado. Eso sostiene los indicadores 1 y 2 y la competencia de gestión, que es mi rol en el equipo.</w:t>
+      </w:r>
+    </w:p>
+    <w:p>
+      <w:pPr>
+        <w:spacing w:after="120"/>
+      </w:pPr>
+      <w:r>
+        <w:rPr>
+          <w:rFonts w:ascii="Calibri" w:hAnsi="Calibri" w:cs="Calibri" w:eastAsia="Calibri"/>
+          <w:b/>
+          <w:i w:val="0"/>
+          <w:color w:val="000000"/>
+          <w:sz w:val="22"/>
+        </w:rPr>
+        <w:t xml:space="preserve">Aspecto por mejorar principal. </w:t>
+      </w:r>
+      <w:r>
+        <w:rPr>
+          <w:rFonts w:ascii="Calibri" w:hAnsi="Calibri" w:cs="Calibri" w:eastAsia="Calibri"/>
+          <w:b w:val="0"/>
+          <w:i w:val="0"/>
+          <w:color w:val="000000"/>
+          <w:sz w:val="22"/>
+        </w:rPr>
+        <w:t>Mi aporte de código. Hasta ahora contribuí sobre todo con documentación, coordinación y revisión, y el repositorio lo refleja: 5 commits míos contra 27 de Joaquín. La evaluación de avance mide la equidad en Git, así que mi prioridad para las próximas semanas es construir y subir el agente Edge y el receptor simulado, que son mis tareas en la Gantt.</w:t>
       </w:r>
     </w:p>
     <w:sectPr>
@@ -10725,342 +13692,63 @@
     </w:pPr>
     <w:r>
       <w:rPr>
-        <w:rtl w:val="0"/>
+        <w:rFonts w:ascii="Calibri" w:hAnsi="Calibri" w:cs="Calibri" w:eastAsia="Calibri"/>
+        <w:b w:val="0"/>
+        <w:i w:val="0"/>
+        <w:color w:val="000000"/>
+        <w:sz w:val="18"/>
       </w:rPr>
+      <w:t xml:space="preserve">Página </w:t>
     </w:r>
     <w:r>
-      <mc:AlternateContent>
-        <mc:Choice Requires="wpg">
-          <w:drawing>
-            <wp:anchor allowOverlap="1" behindDoc="0" distB="0" distT="0" distL="0" distR="0" hidden="0" layoutInCell="1" locked="0" relativeHeight="0" simplePos="0">
-              <wp:simplePos x="0" y="0"/>
-              <wp:positionH relativeFrom="column">
-                <wp:posOffset>-4761</wp:posOffset>
-              </wp:positionH>
-              <wp:positionV relativeFrom="paragraph">
-                <wp:posOffset>-103820</wp:posOffset>
-              </wp:positionV>
-              <wp:extent cx="466725" cy="329565"/>
-              <wp:effectExtent b="0" l="0" r="0" t="0"/>
-              <wp:wrapSquare wrapText="bothSides" distB="0" distT="0" distL="0" distR="0"/>
-              <wp:docPr id="2" name=""/>
-              <a:graphic>
-                <a:graphicData uri="http://schemas.microsoft.com/office/word/2010/wordprocessingShape">
-                  <wps:wsp>
-                    <wps:cNvSpPr/>
-                    <wps:cNvPr id="6" name="Shape 6"/>
-                    <wps:spPr>
-                      <a:xfrm>
-                        <a:off x="5117400" y="3619980"/>
-                        <a:ext cx="457200" cy="320040"/>
-                      </a:xfrm>
-                      <a:prstGeom prst="rect">
-                        <a:avLst/>
-                      </a:prstGeom>
-                      <a:solidFill>
-                        <a:schemeClr val="dk1"/>
-                      </a:solidFill>
-                      <a:ln>
-                        <a:noFill/>
-                      </a:ln>
-                    </wps:spPr>
-                    <wps:txbx>
-                      <w:txbxContent>
-                        <w:p>
-                          <w:pPr>
-                            <w:spacing w:after="0" w:before="0" w:line="240"/>
-                            <w:ind w:left="0" w:right="0" w:firstLine="0"/>
-                            <w:jc w:val="right"/>
-                            <w:textDirection w:val="btLr"/>
-                          </w:pPr>
-                          <w:r>
-                            <w:rPr>
-                              <w:rFonts w:ascii="Arial" w:cs="Arial" w:eastAsia="Arial" w:hAnsi="Arial"/>
-                              <w:b w:val="0"/>
-                              <w:i w:val="0"/>
-                              <w:smallCaps w:val="0"/>
-                              <w:strike w:val="0"/>
-                              <w:color w:val="ffffff"/>
-                              <w:sz w:val="22"/>
-                              <w:vertAlign w:val="baseline"/>
-                            </w:rPr>
-                            <w:t xml:space="preserve">5</w:t>
-                          </w:r>
-                        </w:p>
-                      </w:txbxContent>
-                    </wps:txbx>
-                    <wps:bodyPr anchorCtr="0" anchor="b" bIns="45700" lIns="91425" spcFirstLastPara="1" rIns="91425" wrap="square" tIns="45700">
-                      <a:noAutofit/>
-                    </wps:bodyPr>
-                  </wps:wsp>
-                </a:graphicData>
-              </a:graphic>
-            </wp:anchor>
-          </w:drawing>
-        </mc:Choice>
-        <mc:Fallback>
-          <w:drawing>
-            <wp:anchor allowOverlap="1" behindDoc="0" distB="0" distT="0" distL="0" distR="0" hidden="0" layoutInCell="1" locked="0" relativeHeight="0" simplePos="0">
-              <wp:simplePos x="0" y="0"/>
-              <wp:positionH relativeFrom="column">
-                <wp:posOffset>-4761</wp:posOffset>
-              </wp:positionH>
-              <wp:positionV relativeFrom="paragraph">
-                <wp:posOffset>-103820</wp:posOffset>
-              </wp:positionV>
-              <wp:extent cx="466725" cy="329565"/>
-              <wp:effectExtent b="0" l="0" r="0" t="0"/>
-              <wp:wrapSquare wrapText="bothSides" distB="0" distT="0" distL="0" distR="0"/>
-              <wp:docPr id="2" name="image3.png"/>
-              <a:graphic>
-                <a:graphicData uri="http://schemas.openxmlformats.org/drawingml/2006/picture">
-                  <pic:pic>
-                    <pic:nvPicPr>
-                      <pic:cNvPr id="0" name="image3.png"/>
-                      <pic:cNvPicPr preferRelativeResize="0"/>
-                    </pic:nvPicPr>
-                    <pic:blipFill>
-                      <a:blip r:embed="rId1"/>
-                      <a:srcRect/>
-                      <a:stretch>
-                        <a:fillRect/>
-                      </a:stretch>
-                    </pic:blipFill>
-                    <pic:spPr>
-                      <a:xfrm>
-                        <a:off x="0" y="0"/>
-                        <a:ext cx="466725" cy="329565"/>
-                      </a:xfrm>
-                      <a:prstGeom prst="rect"/>
-                      <a:ln/>
-                    </pic:spPr>
-                  </pic:pic>
-                </a:graphicData>
-              </a:graphic>
-            </wp:anchor>
-          </w:drawing>
-        </mc:Fallback>
-      </mc:AlternateContent>
+      <w:rPr>
+        <w:rFonts w:ascii="Calibri" w:hAnsi="Calibri" w:cs="Calibri" w:eastAsia="Calibri"/>
+        <w:b w:val="0"/>
+        <w:i w:val="0"/>
+        <w:color w:val="000000"/>
+        <w:sz w:val="18"/>
+      </w:rPr>
+      <w:fldChar w:fldCharType="begin"/>
     </w:r>
     <w:r>
-      <mc:AlternateContent>
-        <mc:Choice Requires="wpg">
-          <w:drawing>
-            <wp:anchor allowOverlap="1" behindDoc="0" distB="0" distT="0" distL="0" distR="0" hidden="0" layoutInCell="1" locked="0" relativeHeight="0" simplePos="0">
-              <wp:simplePos x="0" y="0"/>
-              <wp:positionH relativeFrom="column">
-                <wp:posOffset>2313940</wp:posOffset>
-              </wp:positionH>
-              <wp:positionV relativeFrom="paragraph">
-                <wp:posOffset>-99058</wp:posOffset>
-              </wp:positionV>
-              <wp:extent cx="5943600" cy="320040"/>
-              <wp:effectExtent b="0" l="0" r="0" t="0"/>
-              <wp:wrapSquare wrapText="bothSides" distB="0" distT="0" distL="0" distR="0"/>
-              <wp:docPr id="1" name=""/>
-              <a:graphic>
-                <a:graphicData uri="http://schemas.microsoft.com/office/word/2010/wordprocessingGroup">
-                  <wpg:wgp>
-                    <wpg:cNvGrpSpPr/>
-                    <wpg:grpSpPr>
-                      <a:xfrm>
-                        <a:off x="2374200" y="3619975"/>
-                        <a:ext cx="5943600" cy="320040"/>
-                        <a:chOff x="2374200" y="3619975"/>
-                        <a:chExt cx="5943600" cy="320050"/>
-                      </a:xfrm>
-                    </wpg:grpSpPr>
-                    <wpg:grpSp>
-                      <wpg:cNvGrpSpPr/>
-                      <wpg:grpSpPr>
-                        <a:xfrm>
-                          <a:off x="2374200" y="3619980"/>
-                          <a:ext cx="5943600" cy="320040"/>
-                          <a:chOff x="0" y="0"/>
-                          <a:chExt cx="5962650" cy="323851"/>
-                        </a:xfrm>
-                      </wpg:grpSpPr>
-                      <wps:wsp>
-                        <wps:cNvSpPr/>
-                        <wps:cNvPr id="3" name="Shape 3"/>
-                        <wps:spPr>
-                          <a:xfrm>
-                            <a:off x="0" y="0"/>
-                            <a:ext cx="5962650" cy="323850"/>
-                          </a:xfrm>
-                          <a:prstGeom prst="rect">
-                            <a:avLst/>
-                          </a:prstGeom>
-                          <a:noFill/>
-                          <a:ln>
-                            <a:noFill/>
-                          </a:ln>
-                        </wps:spPr>
-                        <wps:txbx>
-                          <w:txbxContent>
-                            <w:p>
-                              <w:pPr>
-                                <w:spacing w:after="0" w:before="0" w:line="240"/>
-                                <w:ind w:left="0" w:right="0" w:firstLine="0"/>
-                                <w:jc w:val="left"/>
-                                <w:textDirection w:val="btLr"/>
-                              </w:pPr>
-                            </w:p>
-                          </w:txbxContent>
-                        </wps:txbx>
-                        <wps:bodyPr anchorCtr="0" anchor="ctr" bIns="91425" lIns="91425" spcFirstLastPara="1" rIns="91425" wrap="square" tIns="91425">
-                          <a:noAutofit/>
-                        </wps:bodyPr>
-                      </wps:wsp>
-                      <wps:wsp>
-                        <wps:cNvSpPr/>
-                        <wps:cNvPr id="4" name="Shape 4"/>
-                        <wps:spPr>
-                          <a:xfrm>
-                            <a:off x="19050" y="0"/>
-                            <a:ext cx="5943600" cy="18826"/>
-                          </a:xfrm>
-                          <a:prstGeom prst="rect">
-                            <a:avLst/>
-                          </a:prstGeom>
-                          <a:solidFill>
-                            <a:schemeClr val="dk1"/>
-                          </a:solidFill>
-                          <a:ln>
-                            <a:noFill/>
-                          </a:ln>
-                        </wps:spPr>
-                        <wps:txbx>
-                          <w:txbxContent>
-                            <w:p>
-                              <w:pPr>
-                                <w:spacing w:after="0" w:before="0" w:line="240"/>
-                                <w:ind w:left="0" w:right="0" w:firstLine="0"/>
-                                <w:jc w:val="left"/>
-                                <w:textDirection w:val="btLr"/>
-                              </w:pPr>
-                            </w:p>
-                          </w:txbxContent>
-                        </wps:txbx>
-                        <wps:bodyPr anchorCtr="0" anchor="ctr" bIns="91425" lIns="91425" spcFirstLastPara="1" rIns="91425" wrap="square" tIns="91425">
-                          <a:noAutofit/>
-                        </wps:bodyPr>
-                      </wps:wsp>
-                      <wps:wsp>
-                        <wps:cNvSpPr/>
-                        <wps:cNvPr id="5" name="Shape 5"/>
-                        <wps:spPr>
-                          <a:xfrm>
-                            <a:off x="0" y="66676"/>
-                            <a:ext cx="5943600" cy="257175"/>
-                          </a:xfrm>
-                          <a:prstGeom prst="rect">
-                            <a:avLst/>
-                          </a:prstGeom>
-                          <a:noFill/>
-                          <a:ln>
-                            <a:noFill/>
-                          </a:ln>
-                        </wps:spPr>
-                        <wps:txbx>
-                          <w:txbxContent>
-                            <w:p>
-                              <w:pPr>
-                                <w:spacing w:after="0" w:before="0" w:line="240"/>
-                                <w:ind w:left="0" w:right="0" w:firstLine="0"/>
-                                <w:jc w:val="right"/>
-                                <w:textDirection w:val="btLr"/>
-                              </w:pPr>
-                              <w:r>
-                                <w:rPr>
-                                  <w:rFonts w:ascii="Arial" w:cs="Arial" w:eastAsia="Arial" w:hAnsi="Arial"/>
-                                  <w:b w:val="0"/>
-                                  <w:i w:val="0"/>
-                                  <w:smallCaps w:val="0"/>
-                                  <w:strike w:val="0"/>
-                                  <w:color w:val="000000"/>
-                                  <w:sz w:val="16"/>
-                                  <w:vertAlign w:val="baseline"/>
-                                </w:rPr>
-                                <w:t xml:space="preserve">Subdirección de Evaluación de Resultados de Aprendizaje - Subdirección de Diseño Instruccional </w:t>
-                              </w:r>
-                            </w:p>
-                            <w:p>
-                              <w:pPr>
-                                <w:spacing w:after="0" w:before="0" w:line="240"/>
-                                <w:ind w:left="0" w:right="0" w:firstLine="0"/>
-                                <w:jc w:val="right"/>
-                                <w:textDirection w:val="btLr"/>
-                              </w:pPr>
-                              <w:r>
-                                <w:rPr>
-                                  <w:rFonts w:ascii="Times New Roman" w:cs="Times New Roman" w:eastAsia="Times New Roman" w:hAnsi="Times New Roman"/>
-                                  <w:b w:val="0"/>
-                                  <w:i w:val="0"/>
-                                  <w:smallCaps w:val="0"/>
-                                  <w:strike w:val="0"/>
-                                  <w:color w:val="7f7f7f"/>
-                                  <w:sz w:val="20"/>
-                                  <w:vertAlign w:val="baseline"/>
-                                </w:rPr>
-                              </w:r>
-                            </w:p>
-                          </w:txbxContent>
-                        </wps:txbx>
-                        <wps:bodyPr anchorCtr="0" anchor="b" bIns="0" lIns="91425" spcFirstLastPara="1" rIns="91425" wrap="square" tIns="45700">
-                          <a:noAutofit/>
-                        </wps:bodyPr>
-                      </wps:wsp>
-                    </wpg:grpSp>
-                  </wpg:wgp>
-                </a:graphicData>
-              </a:graphic>
-            </wp:anchor>
-          </w:drawing>
-        </mc:Choice>
-        <mc:Fallback>
-          <w:drawing>
-            <wp:anchor allowOverlap="1" behindDoc="0" distB="0" distT="0" distL="0" distR="0" hidden="0" layoutInCell="1" locked="0" relativeHeight="0" simplePos="0">
-              <wp:simplePos x="0" y="0"/>
-              <wp:positionH relativeFrom="column">
-                <wp:posOffset>2313940</wp:posOffset>
-              </wp:positionH>
-              <wp:positionV relativeFrom="paragraph">
-                <wp:posOffset>-99058</wp:posOffset>
-              </wp:positionV>
-              <wp:extent cx="5943600" cy="320040"/>
-              <wp:effectExtent b="0" l="0" r="0" t="0"/>
-              <wp:wrapSquare wrapText="bothSides" distB="0" distT="0" distL="0" distR="0"/>
-              <wp:docPr id="1" name="image2.png"/>
-              <a:graphic>
-                <a:graphicData uri="http://schemas.openxmlformats.org/drawingml/2006/picture">
-                  <pic:pic>
-                    <pic:nvPicPr>
-                      <pic:cNvPr id="0" name="image2.png"/>
-                      <pic:cNvPicPr preferRelativeResize="0"/>
-                    </pic:nvPicPr>
-                    <pic:blipFill>
-                      <a:blip r:embed="rId1"/>
-                      <a:srcRect/>
-                      <a:stretch>
-                        <a:fillRect/>
-                      </a:stretch>
-                    </pic:blipFill>
-                    <pic:spPr>
-                      <a:xfrm>
-                        <a:off x="0" y="0"/>
-                        <a:ext cx="5943600" cy="320040"/>
-                      </a:xfrm>
-                      <a:prstGeom prst="rect"/>
-                      <a:ln/>
-                    </pic:spPr>
-                  </pic:pic>
-                </a:graphicData>
-              </a:graphic>
-            </wp:anchor>
-          </w:drawing>
-        </mc:Fallback>
-      </mc:AlternateContent>
+      <w:rPr>
+        <w:rFonts w:ascii="Calibri" w:hAnsi="Calibri" w:cs="Calibri" w:eastAsia="Calibri"/>
+        <w:b w:val="0"/>
+        <w:i w:val="0"/>
+        <w:color w:val="000000"/>
+        <w:sz w:val="18"/>
+      </w:rPr>
+      <w:instrText xml:space="preserve"> PAGE </w:instrText>
+    </w:r>
+    <w:r>
+      <w:rPr>
+        <w:rFonts w:ascii="Calibri" w:hAnsi="Calibri" w:cs="Calibri" w:eastAsia="Calibri"/>
+        <w:b w:val="0"/>
+        <w:i w:val="0"/>
+        <w:color w:val="000000"/>
+        <w:sz w:val="18"/>
+      </w:rPr>
+      <w:fldChar w:fldCharType="separate"/>
+    </w:r>
+    <w:r>
+      <w:rPr>
+        <w:rFonts w:ascii="Calibri" w:hAnsi="Calibri" w:cs="Calibri" w:eastAsia="Calibri"/>
+        <w:b w:val="0"/>
+        <w:i w:val="0"/>
+        <w:color w:val="000000"/>
+        <w:sz w:val="18"/>
+      </w:rPr>
+      <w:t>1</w:t>
+    </w:r>
+    <w:r>
+      <w:rPr>
+        <w:rFonts w:ascii="Calibri" w:hAnsi="Calibri" w:cs="Calibri" w:eastAsia="Calibri"/>
+        <w:b w:val="0"/>
+        <w:i w:val="0"/>
+        <w:color w:val="000000"/>
+        <w:sz w:val="18"/>
+      </w:rPr>
+      <w:fldChar w:fldCharType="end"/>
     </w:r>
   </w:p>
 </w:ftr>

</xml_diff>